<commit_message>
Proofcheck Inn Trouble Norwegian: SIGNIFICANT (33 edits); Inn Trouble complete
Co-Authored-By: Claude Opus 5.5 <noreply@anthropic.com>
Claude-Session: https://claude.ai/code/session_012Cm8JxdqzjuttdUSdkQCUg
</commit_message>
<xml_diff>
--- a/translated/corrected/Inn Trouble - ASSEMBLED - FORMATTED_Norwegian.docx
+++ b/translated/corrected/Inn Trouble - ASSEMBLED - FORMATTED_Norwegian.docx
@@ -604,7 +604,7 @@
     </w:p>
     <w:p>
       <w:r>
-        <w:t xml:space="preserve">– I årevis. Hun tørket seg i øynene med bakhånden, en barnslig gest. – Jeg fant det etter at moren min døde. Det sto en kiste på loftet, en gammel reisekiste, låst, og nøkkelen lå blant morens ting med en lapp på i hennes håndskrift som bare sa </w:t>
+        <w:t xml:space="preserve">– I årevis. Hun tørket seg i øynene med bakhånden, en barnslig gest. – Jeg fant det etter at moren min døde. Det sto en kiste på loftet, en gammel reisekiste, låst, og nøkkelen lå blant morens ting med en merkelapp på i hennes håndskrift som bare sa </w:t>
       </w:r>
       <w:r>
         <w:rPr>
@@ -703,7 +703,7 @@
     </w:p>
     <w:p>
       <w:r>
-        <w:t xml:space="preserve">Da Pip og jeg til slutt kom ut av vertshuset, tok kulden pusten fra meg, og jeg ble stående på trappen et øyeblikk med den ene hånden presset flatt over det stedet der lappen lå brettet mot kåpen min. Et tyveri et hundre år gammelt, og nå kunne ikke en god kvinne sove på grunn av det. Og bare to steder i verden hemmeligheten kunne ha kommet fra, og det ene av dem en boks som bare Fiona kunne åpne.</w:t>
+        <w:t xml:space="preserve">Da Pip og jeg til slutt kom ut av vertshuset, tok kulden pusten fra meg, og jeg ble stående på verandaen et øyeblikk med den ene hånden presset flatt over det stedet der lappen lå brettet mot kåpen min. Et tyveri et hundre år gammelt, og nå kunne ikke en god kvinne sove på grunn av det. Og bare to steder i verden hemmeligheten kunne ha kommet fra, og det ene av dem en boks som bare Fiona kunne åpne.</w:t>
       </w:r>
     </w:p>
     <w:p>
@@ -713,7 +713,7 @@
     </w:p>
     <w:p>
       <w:r>
-        <w:t>– Pip, sa jeg idet jeg gikk ned de rimlyse trinnene. – Vi skal til historielaget. Ikke i dag. Jeg vil tenke meg om først, og snakke med Nick. Men snart. Vi kommer til å gå dit og stå blant eskene, og vi kommer til å finne ut hvem som har lest dem.</w:t>
+        <w:t>– Pip, sa jeg idet jeg gikk ned de rimlyse trinnene. – Vi skal til Historielaget. Ikke i dag. Jeg vil tenke meg om først, og snakke med Nick. Men snart. Vi kommer til å gå dit og stå blant eskene, og vi kommer til å finne ut hvem som har lest dem.</w:t>
       </w:r>
     </w:p>
     <w:p>
@@ -879,7 +879,7 @@
     <w:p/>
     <w:p>
       <w:r>
-        <w:t>Den kvelden, før vi la oss, gikk jeg bort til vinduet, slik jeg alltid gjorde, for å se på at byen falt til ro for natten. Hytta vår lå litt for seg selv ovenfor resten, oppover veien, med hagen og verkstedets mørke silhuett bakenfor, og deretter byen nedenfor. Byen var opplyst.</w:t>
+        <w:t>Den kvelden, før vi la oss, gikk jeg bort til vinduet, slik jeg alltid gjorde, for å se på at byen falt til ro for natten. Hytta vår lå litt for seg selv ovenfor resten, oppover veien, med luftegården og verkstedets mørke silhuett bakenfor, og deretter byen nedenfor. Byen var opplyst.</w:t>
       </w:r>
     </w:p>
     <w:p/>
@@ -963,7 +963,7 @@
     <w:p/>
     <w:p>
       <w:r>
-        <w:t>Vi ble stående der en stund til mens vi så på gullbyen, og så gikk vi opp og la oss. Jeg lå våken en god stund i mørket og holdt på to ting samtidig. Et sted nede i Frost Falls hadde et menneske stått blant Blackburn-eskene og funnet en måte å lukke hånden om halsen på en god kvinne for en halv million dollar. Og ute forbi hagen bygget mannen min en overraskelse han nektet å navngi, mens lysene ble gylne av seg selv og magien vi hadde brakt med oss, gikk på jakt i mørket etter et sted å lande.</w:t>
+        <w:t>Vi ble stående der en stund til mens vi så på gullbyen, og så gikk vi opp og la oss. Jeg lå våken en god stund i mørket og holdt på to ting samtidig. Et sted nede i Frost Falls hadde et menneske stått blant Blackburn-eskene og funnet en måte å lukke hånden om halsen på en god kvinne for en halv million dollar. Og ute forbi luftegården bygget mannen min en overraskelse han nektet å navngi, mens lysene ble gylne av seg selv og magien vi hadde brakt med oss, gikk på jakt i mørket etter et sted å lande.</w:t>
       </w:r>
     </w:p>
     <w:p/>
@@ -1133,7 +1133,7 @@
     </w:p>
     <w:p>
       <w:r>
-        <w:t>Jeg lo ikke. Jeg stod helt stille midt i det varme, leende rommet og kjente kulden stige opp gjennom meg, for de mest interessante Blackburn-brevene, de som ville avsløre at en brosje hadde forsvunnet og hvor den hadde havnet, hadde kommet på avveie. Og brettet inn i innerlommen på kåpen min lå et utpressingsbrev som visste nøyaktig hva de brevene inneholdt.</w:t>
+        <w:t>Jeg lo ikke. Jeg stod helt stille midt i det varme, leende rommet og kjente kulden stige opp gjennom meg, for de mest interessante Blackburn-brevene, de som ville avsløre at en brosje hadde forsvunnet og hvor den hadde havnet, hadde kommet på avveie. Og brettet inn i innerlommen på kåpen min lå en utpressingslapp som visste nøyaktig hva de brevene inneholdt.</w:t>
       </w:r>
     </w:p>
     <w:p>
@@ -1594,7 +1594,7 @@
     <w:p/>
     <w:p>
       <w:r>
-        <w:t>– Si det til Bram. Jeg skrev ut en advarsel til ham i forrige uke på grunn av Komet i Maple Street, og han takket meg for det. Ene munnviken hennes rykket oppover. – Ingen takker meg for en advarsel.</w:t>
+        <w:t>– Si det til Bram. Jeg skrev ut en advarsel til ham i forrige uke på grunn av Comet i Maple Street, og han takket meg for det. Ene munnviken hennes rykket oppover. – Ingen takker meg for en advarsel.</w:t>
       </w:r>
     </w:p>
     <w:p/>
@@ -1666,7 +1666,7 @@
     <w:p/>
     <w:p>
       <w:r>
-        <w:t xml:space="preserve">Så rettet jeg meg opp. Det lå fremdeles et utpressingsbrev brettet sammen i kåpen min, et styremøte i vente og en sliten mann blant alle esker og kasser.</w:t>
+        <w:t xml:space="preserve">Så rettet jeg meg opp. Det lå fremdeles en utpressingslapp brettet sammen i kåpen min, et styremøte i vente og en sliten mann blant alle esker og kasser.</w:t>
       </w:r>
     </w:p>
     <w:p/>
@@ -1750,7 +1750,7 @@
     </w:p>
     <w:p>
       <w:r>
-        <w:t>– Du er modigere enn du tror, sa jeg til slutt. – Du har båret hemmeligheten hennes alene i alle disse årene og aldri latt den gjøre deg kald. Vertshuset er fremdeles varmt, Fiona. Etter hundre år og en låst kiste og et utpressingsbrev er det fremdeles det varmeste huset i byen. Det er ikke ingenting. Det er hele kjernen i det hun bygde, holdt i live av deg.</w:t>
+        <w:t>– Du er modigere enn du tror, sa jeg til slutt. – Du har båret hemmeligheten hennes alene i alle disse årene og aldri latt den gjøre deg kald. Vertshuset er fremdeles varmt, Fiona. Etter hundre år og en låst kiste og en utpressingslapp er det fremdeles det varmeste huset i byen. Det er ikke ingenting. Det er hele kjernen i det hun bygde, holdt i live av deg.</w:t>
       </w:r>
     </w:p>
     <w:p>
@@ -2411,7 +2411,7 @@
     <w:p/>
     <w:p>
       <w:r>
-        <w:t xml:space="preserve">Rådhuset var en overpyntet mursteinsbygning i enden av allmenningen, med et klokketårn som hadde gått fire minutter for fort så lenge noen kunne huske. Jeg gikk dit på mandagen sammen med Pip på to ærend, ett av dem ekte og ett av dem mindre så. Det ekte ærendet var å føre syklubbens navn opp på festivalens hjelperliste, og å spørre – på vegne av ingen andre enn byen selv – om Frost Falls kunne finne en liten slant til historielaget før taket raste sammen for godt. Det mindre ekte ærendet var å se ordentlig og på nært hold på Vera Reed.</w:t>
+        <w:t xml:space="preserve">Rådhuset var en overpyntet mursteinsbygning i enden av allmenningen, med et klokketårn som hadde gått fire minutter for fort så lenge noen kunne huske. Jeg gikk dit på mandagen sammen med Pip på to ærend, ett av dem ekte og ett av dem mindre så. Det ekte ærendet var å føre syklubbens navn opp på festivalens hjelperliste, og å spørre – på vegne av ingen andre enn byen selv – om Frost Falls kunne finne en liten slant til Historielaget før taket raste sammen for godt. Det mindre ekte ærendet var å se ordentlig og på nært hold på Vera Reed.</w:t>
       </w:r>
     </w:p>
     <w:p/>
@@ -2441,7 +2441,7 @@
     <w:p/>
     <w:p>
       <w:r>
-        <w:t xml:space="preserve">Han hadde et minutt, og han avså det fra bak det rene skrivebordet sitt uten å gjøre seg den umaken å reise seg. Jeg la fram saken for historielaget så godt jeg evnet. At taket lakk inn i bakrommene. At fyrkjelen var inne i sin siste vinter. To århundrer med byens minne som sakte gikk i oppløsning for mangel på en brøkdel av det byen ville brukt på en eneste festivalhelg. Jeg la det fram varmt, og jeg la det fram kort. Claire hadde fortalt meg at triste historier ikke rister løs penger, og jeg forsøkte meg på noe stødigere og vanskeligere å feie til side enn tristhet.</w:t>
+        <w:t xml:space="preserve">Han hadde et minutt, og han avså det fra bak det rene skrivebordet sitt uten å gjøre seg den umaken å reise seg. Jeg la fram saken for Historielaget så godt jeg evnet. At taket lakk inn i bakrommene. At fyrkjelen var inne i sin siste vinter. To århundrer med byens minne som sakte gikk i oppløsning for mangel på en brøkdel av det byen ville brukt på en eneste festivalhelg. Jeg la det fram varmt, og jeg la det fram kort. Claire hadde fortalt meg at triste historier ikke rister løs penger, og jeg forsøkte meg på noe stødigere og vanskeligere å feie til side enn tristhet.</w:t>
       </w:r>
     </w:p>
     <w:p/>
@@ -2465,7 +2465,7 @@
     <w:p/>
     <w:p>
       <w:r>
-        <w:t>Det seilte rett forbi ham, slik det meste gjorde. Jeg takket ham for hans tid, som ikke hadde kostet ham noe og ville avkaste historielaget betraktelig mindre. Deretter gikk jeg ut igjen til Veras skrivebord for å gjøre ærendet jeg egentlig hadde kommet for, som var å se og å høre.</w:t>
+        <w:t>Det seilte rett forbi ham, slik det meste gjorde. Jeg takket ham for hans tid, som ikke hadde kostet ham noe og ville avkaste Historielaget betraktelig mindre. Deretter gikk jeg ut igjen til Veras skrivebord for å gjøre ærendet jeg egentlig hadde kommet for, som var å se og å høre.</w:t>
       </w:r>
     </w:p>
     <w:p/>
@@ -2790,7 +2790,7 @@
     <w:p/>
     <w:p>
       <w:r>
-        <w:t>Jeg lot det synke inn, slik jeg hadde gjort med Sams tjue dollar. Her var en mann dypt oppetter ørene i gjeld, med alle grunner i verden og alle anledninger i tillegg. Svaret hans på det var å stå vakt over byens festival hele natta mot et honorar og lære bestemødre å ta utfallsskritt klokka halv seks om morgenen. Jamal jobbet tre jobber for å klamre seg ut av hullet sitt på den ærlige, slitsomme, skritt-for-skritt-måten, og det stemte ikke med et utpressingsbrev på en halv million dollar. Regnestykket gikk ikke opp. Om Jamal Washington på noen som helst måte hadde klart å trylle fram den slags penger fra en hemmelighet, ville han ikke ha stilt vekkerklokken på fem.</w:t>
+        <w:t>Jeg lot det synke inn, slik jeg hadde gjort med Sams tjue dollar. Her var en mann dypt oppetter ørene i gjeld, med alle grunner i verden og alle anledninger i tillegg. Svaret hans på det var å stå vakt over byens festival hele natta mot et honorar og lære bestemødre å ta utfallsskritt klokka halv seks om morgenen. Jamal jobbet tre jobber for å klamre seg ut av hullet sitt på den ærlige, slitsomme, skritt-for-skritt-måten, og det stemte ikke med en utpressingslapp på en halv million dollar. Regnestykket gikk ikke opp. Om Jamal Washington på noen som helst måte hadde klart å trylle fram den slags penger fra en hemmelighet, ville han ikke ha stilt vekkerklokken på fem.</w:t>
       </w:r>
     </w:p>
     <w:p/>
@@ -2915,7 +2915,7 @@
     <w:p/>
     <w:p>
       <w:r>
-        <w:t xml:space="preserve">Ute på allmenningen var det derimot Brams problemer som gjaldt. Prancer hadde sluppet seg ut av innhegningen i løpet av natten og kommet ned i byen, og nå sto hun i bunnen av byens fontene, som ble skrudd av hver oktober, med høstblader opp til anklene. Hun sto der med hodet høyt hevet og nektet å rikke seg.</w:t>
+        <w:t xml:space="preserve">Ute på allmenningen var det derimot Brams problemer som gjaldt. Prancer hadde sluppet seg ut av luftegården i løpet av natten og kommet ned i byen, og nå sto hun i bunnen av byens fontene, som ble skrudd av hver oktober, med høstblader opp til anklene. Hun sto der med hodet høyt hevet og nektet å rikke seg.</w:t>
       </w:r>
     </w:p>
     <w:p/>
@@ -3333,7 +3333,7 @@
     <w:p/>
     <w:p>
       <w:r>
-        <w:t xml:space="preserve">– Utpressing. Han sa ordet lavt, som om det smakte vondt. – Fiona. Og jeg har stått på verandaen hennes i tre uker og vært sur for tjue dollar mens hun har båret på alt det der. Han presset håndbaken hardt mot pannen, slik at det ble en mørk flekk der. – Si til henne at det er tilgitt. De tjue dollarene, hele bestillingen, hver eneste cent, si til henne at jeg aldri vil høre et ord om det igjen så lenge jeg lever. Gud. Jeg gjorde det verre, ikke sant? Maste på henne om penger mens hun holdt på å drukne. Jeg gjorde det verre uten å vite det.</w:t>
+        <w:t xml:space="preserve">– Utpressing. Han sa ordet lavt, som om det smakte vondt. – Fiona. Og jeg har stått på verandaen hennes i tre uker og vært sur for tjue dollar mens hun har båret på alt det der. Han presset håndroten hardt mot pannen, slik at det ble en mørk flekk der. – Si til henne at det er tilgitt. De tjue dollarene, hele bestillingen, hver eneste cent, si til henne at jeg aldri vil høre et ord om det igjen så lenge jeg lever. Gud. Jeg gjorde det verre, ikke sant? Maste på henne om penger mens hun holdt på å drukne. Jeg gjorde det verre uten å vite det.</w:t>
       </w:r>
     </w:p>
     <w:p/>
@@ -3464,7 +3464,7 @@
     <w:p/>
     <w:p>
       <w:r>
-        <w:t xml:space="preserve">Jeg åpnet den. Det var grundig arbeid, hundre år sporet side for side. Og den sa ikke det utpressingsbrevet sa. Den sa mer enn lappen, og den sa det snillere.</w:t>
+        <w:t xml:space="preserve">Jeg åpnet den. Det var grundig arbeid, hundre år sporet side for side. Og den sa ikke det utpressingslappen sa. Den sa mer enn lappen, og den sa det snillere.</w:t>
       </w:r>
     </w:p>
     <w:p/>
@@ -3583,7 +3583,7 @@
     <w:p/>
     <w:p>
       <w:r>
-        <w:t xml:space="preserve">Jeg stivnet til. Jeg har lært meg gjennom et langt liv å ikke la kroppen røpe meg, og jeg trengte hver eneste smule av den treningen nå, der jeg satt ved Theos arbeidsbord med kortet hans i hånda, fordi utpressingsbrevet brettet i kåpa mi brukte akkurat de samme ordene. Ikke ord som liknet. De ordene. Jeg trengte ikke å ta fram lappen for å være sikker; jeg hadde lest den hundre ganger og hadde den brennmerket på netthinnen. Safiren i hjertet. Det er en merkelig måte å beskrive en brosje på, litt poetisk, en historikers formulering og ikke en tyvs. Det sto i utpressingsbrevet nøyaktig slik det sto på Theos kort, de samme tre ordene i samme rekkefølge. To mennesker beskriver ikke et smykke med de samme tre rare ordene ved en tilfeldighet.</w:t>
+        <w:t xml:space="preserve">Jeg stivnet til. Jeg har lært meg gjennom et langt liv å ikke la kroppen røpe meg, og jeg trengte hver eneste smule av den treningen nå, der jeg satt ved Theos arbeidsbord med kortet hans i hånda, fordi utpressingslappen brettet i kåpa mi brukte akkurat de samme ordene. Ikke ord som liknet. De ordene. Jeg trengte ikke å ta fram lappen for å være sikker; jeg hadde lest den hundre ganger og hadde den brennmerket på netthinnen. Safiren i hjertet. Det er en merkelig måte å beskrive en brosje på, litt poetisk, en historikers formulering og ikke en tyvs. Det sto i utpressingslappen nøyaktig slik det sto på Theos kort, de samme tre ordene i samme rekkefølge. To mennesker beskriver ikke et smykke med de samme tre rare ordene ved en tilfeldighet.</w:t>
       </w:r>
     </w:p>
     <w:p/>
@@ -3688,7 +3688,7 @@
     <w:p/>
     <w:p>
       <w:r>
-        <w:t>Det strømmet opp som gull i vinduene, helt plutselig, selv om det var stummende mørkt ute og hadde vært det i en time. Varmt og levende veltet det inn fra området bortenfor innhegningen, fra verkstedet, lyst nok til å kaste skyggene av vinduskarmene i lange gullstriper over kjøkkengulvet. Pip reiste seg fra grua. Utenfra kom en svak, klar lyd som fra et utall fjerne klokker, eller en stor peisild som synker sammen på en gang.</w:t>
+        <w:t>Det strømmet opp som gull i vinduene, helt plutselig, selv om det var stummende mørkt ute og hadde vært det i en time. Varmt og levende veltet det inn fra området bortenfor luftegården, fra verkstedet, lyst nok til å kaste skyggene av vinduskarmene i lange gullstriper over kjøkkengulvet. Pip reiste seg fra grua. Utenfra kom en svak, klar lyd som fra et utall fjerne klokker, eller en stor peisild som synker sammen på en gang.</w:t>
       </w:r>
     </w:p>
     <w:p/>
@@ -3938,7 +3938,7 @@
     </w:p>
     <w:p>
       <w:r>
-        <w:t xml:space="preserve">Pip var en sensasjon. Jeg visste at hun kom til å bli det. Fiona hadde satt opp et hjørne av vertshusverandaen som fotostudio, med en stol, et malt vinterbakteppe og en kurv med strikkede skjerf, og for en dollar til historielaget kunne man bli avfotografert med Nordpolens egen pingvin. Køen strakte seg hele veien langs verandaen og ned trappene hele ettermiddagen. Pip hadde på seg et nytt skjerf på hvert eneste bilde og tok imot tilbedelsen som sin eldgamle rett. Hun avslo, med stor verdighet, hvert eneste stykke sandkake barna prøvde å snike til henne under bordet. Dollarene tårnet seg opp i glasset, og det var de første pengene laget hadde fått inn siden Olivias kasseapparat. Det kom ikke til å redde dem. Et glass med dollarer kunne ikke redde en bygning. Men det var noe, og det var varmt. Fiona stod ved siden av boden og tok imot dollarne med et ekte smil, og for én ettermiddag så hun ut som seg selv igjen.</w:t>
+        <w:t xml:space="preserve">Pip var en sensasjon. Jeg visste at hun kom til å bli det. Fiona hadde satt opp et hjørne av vertshusverandaen som fotostudio, med en stol, et malt vinterbakteppe og en kurv med strikkede skjerf, og for en dollar til Historielaget kunne man bli avfotografert med Nordpolens egen pingvin. Køen strakte seg hele veien langs verandaen og ned trappene hele ettermiddagen. Pip hadde på seg et nytt skjerf på hvert eneste bilde og tok imot tilbedelsen som sin eldgamle rett. Hun avslo, med stor verdighet, hvert eneste stykke sandkake barna prøvde å snike til henne under bordet. Dollarene tårnet seg opp i glasset, og det var de første pengene laget hadde fått inn siden Olivias kasseapparat. Det kom ikke til å redde dem. Et glass med dollarer kunne ikke redde en bygning. Men det var noe, og det var varmt. Fiona stod ved siden av boden og tok imot dollarne med et ekte smil, og for én ettermiddag så hun ut som seg selv igjen.</w:t>
       </w:r>
     </w:p>
     <w:p>
@@ -4065,7 +4065,7 @@
         <w:t xml:space="preserve">Safiren i hjertet</w:t>
       </w:r>
       <w:r>
-        <w:t xml:space="preserve">: tre ord, en historikers formulering og ikke en tyvs, som lå i utpressingsbrevet nøyaktig slik de lå på kortet i Theos omhyggelige, skråstilte håndskrift. Lappen var skrevet på Historielagets kremfargede brevpapir, det tykke riflede papiret jeg hadde sett ligge i stabler på resepsjonsdisken under utstillingen. Mannen som drev arkivet, var i ferd med å drukne. Han hadde banket på hver eneste ærlige dør i tre delstater og sett dem bli lukket. Han hadde reist seg foran hele byen og fortalt, med et trist drag i munnen, at selve brevene som beskrev brosjen, hadde kommet på avveie.</w:t>
+        <w:t xml:space="preserve">: tre ord, en historikers formulering og ikke en tyvs, som lå i utpressingslappen nøyaktig slik de lå på kortet i Theos omhyggelige, skråstilte håndskrift. Lappen var skrevet på Historielagets kremfargede brevpapir, det tykke riflede papiret jeg hadde sett ligge i stabler på resepsjonsdisken under utstillingen. Mannen som drev arkivet, var i ferd med å drukne. Han hadde banket på hver eneste ærlige dør i tre delstater og sett dem bli lukket. Han hadde reist seg foran hele byen og fortalt, med et trist drag i munnen, at selve brevene som beskrev brosjen, hadde kommet på avveie.</w:t>
       </w:r>
     </w:p>
     <w:p/>
@@ -4122,7 +4122,7 @@
     <w:p/>
     <w:p>
       <w:r>
-        <w:t xml:space="preserve">Jeg satt helt stille i lampelyset. Brosjens tyveri og vertshusets kjøp var to forskjellige hemmeligheter, oppbevart i to forskjellige bygninger. Theo hadde den ene. Han hadde arkivet, brevene, katalogkortet, papiret. Han hadde tyveriet. Men beviset på at stjålne penger hadde blitt til dette kjære vertshuset, fantes på rådhuset, i eiendomsarkivene som en stiv, trett kvinne hadde sett meg inn i øynene og sverget på at hun aldri leste.</w:t>
+        <w:t xml:space="preserve">Jeg satt helt stille i lampelyset. Brosjens tyveri og vertshusets kjøp var to forskjellige hemmeligheter, oppbevart i to forskjellige bygninger. Theo hadde den ene. Han hadde arkivet, brevene, katalogkortet, papiret. Han visste om tyveriet. Men beviset på at stjålne penger hadde blitt til dette kjære vertshuset, fantes på rådhuset, i eiendomsarkivene som en stiv, trett kvinne hadde sett meg inn i øynene og sverget på at hun aldri leste.</w:t>
       </w:r>
     </w:p>
     <w:p/>
@@ -4253,7 +4253,7 @@
     <w:p/>
     <w:p>
       <w:r>
-        <w:t xml:space="preserve">Theo hadde tyveriet. Han hadde funnet det i Blackburn-brevene, brosjen, stenen, pantelåneren. Han hadde katalogisert det med sin omhyggelige hånd, safiren i hjertet, og så hadde han trukket de brevene ut fra arkivene og erklært dem forsvunnet. Men Theo, som druknet, overvåket av hele byen, aldri hjemme, kunne ikke ha gjort resten av det. Han kunne ikke ha bekreftet at vertshuset hadde blitt kjøpt for de pengene, for det beviset fantes ikke i hans bygning. Og han kunne ikke ha båret lappene tvers over byen og lagt en på et fullstappet skrivebord i fullt dagslys under festivalen, for Theo Hussein kunne ikke gå ned Evergreen Avenue ubemerket om det så gjaldt liv og død.</w:t>
+        <w:t xml:space="preserve">Theo visste om tyveriet. Han hadde funnet det i Blackburn-brevene, brosjen, stenen, pantelåneren. Han hadde katalogisert det med sin omhyggelige hånd, safiren i hjertet, og så hadde han trukket de brevene ut fra arkivene og erklært dem forsvunnet. Men Theo, som druknet, overvåket av hele byen, aldri hjemme, kunne ikke ha gjort resten av det. Han kunne ikke ha bekreftet at vertshuset hadde blitt kjøpt for de pengene, for det beviset fantes ikke i hans bygning. Og han kunne ikke ha båret lappene tvers over byen og lagt en på et fullstappet skrivebord i fullt dagslys under festivalen, for Theo Hussein kunne ikke gå ned Evergreen Avenue ubemerket om det så gjaldt liv og død.</w:t>
       </w:r>
     </w:p>
     <w:p/>
@@ -4306,7 +4306,7 @@
     <w:p/>
     <w:p>
       <w:r>
-        <w:t xml:space="preserve">Det stilte seg slik. Jeg visste hvem. Jeg visste hvordan. Jeg hadde bevisene på det: katalogkortet, det matchede papiret holdt opp mot lampen, skjøtet til vertshuset som lå framme i stedet for i skuffen sin. Så jeg kunne gå til Theo og Vera i all stillhet, bare vi tre, ingen andre involvert i det hele tatt, og si: Jeg vet det. Stopp nå, og det slutter her, i kveld, uten at noen andre anar det. Aldri mer. Og det ville de, for de var redde mennesker og ikke forherdede. De ville gråte av lettelse over å slippe unna. Lappene ville slutte, og Fiona ville være trygg. Hemmeligheten ville legges tilbake i kisten på loftet. Theo ville beholde historielaget sitt og sitt gode navn, og Vera jobben sin. Byen ville aldri behøve å få vite at to av dens egne hadde stelt seg ille i en eneste hard sesong. Alle jeg var glad i, ville bli skånet for sorgen over det.</w:t>
+        <w:t xml:space="preserve">Det stilte seg slik. Jeg visste hvem. Jeg visste hvordan. Jeg hadde bevisene på det: katalogkortet, det matchede papiret holdt opp mot lampen, skjøtet til vertshuset som lå framme i stedet for i skuffen sin. Så jeg kunne gå til Theo og Vera i all stillhet, bare vi tre, ingen andre involvert i det hele tatt, og si: Jeg vet det. Stopp nå, og det slutter her, i kveld, uten at noen andre anar det. Aldri mer. Og det ville de, for de var redde mennesker og ikke forherdede. De ville gråte av lettelse over å slippe unna. Lappene ville slutte, og Fiona ville være trygg. Hemmeligheten ville legges tilbake i kisten på loftet. Theo ville beholde Historielaget sitt og sitt gode navn, og Vera jobben sin. Byen ville aldri behøve å få vite at to av dens egne hadde stelt seg ille i en eneste hard sesong. Alle jeg var glad i, ville bli skånet for sorgen over det.</w:t>
       </w:r>
     </w:p>
     <w:p/>
@@ -4419,7 +4419,7 @@
     <w:p/>
     <w:p>
       <w:r>
-        <w:t xml:space="preserve">Politisjef Tanaka lyttet til meg på det lille kontoret sitt på stasjonen, med den slitte notatboken åpen på skrivebordet foran seg og pennen liggende urørlig oppå. Hun skrev ikke mens hun avgjorde om hun skulle tro på deg. Jeg la alt på bordet, slik jeg hadde lagt det fram for meg selv ved kjøkkenbordet. De to lappene. Theos katalogkort med de tre matchende ordene. Historielagets brevpapir, med identisk papirstruktur under lampen. Vertshusets skjøte som lå ute av skuffen i Veras mappeboks. Constance, brosjen, pantelåneren i Ridgeline, hele den hundre år gamle roten til saken, og Neils mappe under alt sammen, den delen som gjorde roten til et menneskelig anliggende.</w:t>
+        <w:t xml:space="preserve">Politisjef Tanaka lyttet til meg på det lille kontoret sitt på stasjonen, med den slitte notatboken åpen på skrivebordet foran seg og pennen liggende urørlig oppå. Hun skrev ikke mens hun avgjorde om hun skulle tro på deg. Jeg la alt på bordet, slik jeg hadde lagt det fram for meg selv ved kjøkkenbordet. De to lappene. Theos katalogkort med de tre matchende ordene. Historielagets brevpapir, med identisk papirstruktur under lampen. Vertshusets skjøte som lå ute av skuffen i Veras kurv for gjeninnplassering. Constance, brosjen, pantelåneren i Ridgeline, hele den hundre år gamle roten til saken, og Neils mappe under alt sammen, den delen som gjorde roten til et menneskelig anliggende.</w:t>
       </w:r>
     </w:p>
     <w:p/>
@@ -4580,7 +4580,7 @@
     <w:p/>
     <w:p>
       <w:r>
-        <w:t xml:space="preserve">– Theo, sa jeg. – Utpressingsbrevene til Fiona ble skrevet på Historielagets brevpapir. Det tykke, kremfargede papiret med de fine linjene. Jeg matchet det korn for korn mot et ark fra lageret ditt. Han skvatt til, men jeg fortsatte, stødig. – Og de beskriver brosjen som safiren i hjertet. Det er dine ord, Theo. De står på katalogkortet ditt, med din egen håndskrift, kortet for Blackburn-brevene som du fortalte hele byen under åpningen at hadde blitt borte. Brevene ble ikke borte. Du fjernet dem fordi de holdt på hemmeligheten, og så kalte du dem savnet slik at ingen skulle komme på å spørre hva som sto i dem. Jeg stanset, og lot den neste delen komme mykt. – Du fant en måte å redde Historielaget i de brevene. Og du grep den. Ikke sant?</w:t>
+        <w:t xml:space="preserve">– Theo, sa jeg. – Utpressingslappene til Fiona ble skrevet på Historielagets brevpapir. Det tykke, kremfargede papiret med de fine linjene. Jeg matchet det korn for korn mot et ark fra lageret ditt. Han skvatt til, men jeg fortsatte, stødig. – Og de beskriver brosjen som safiren i hjertet. Det er dine ord, Theo. De står på katalogkortet ditt, med din egen håndskrift, kortet for Blackburn-brevene som du fortalte hele byen under åpningen at hadde blitt borte. Brevene ble ikke borte. Du fjernet dem fordi de holdt på hemmeligheten, og så kalte du dem savnet slik at ingen skulle komme på å spørre hva som sto i dem. Jeg stanset, og lot den neste delen komme mykt. – Du fant en måte å redde Historielaget i de brevene. Og du grep den. Ikke sant?</w:t>
       </w:r>
     </w:p>
     <w:p/>
@@ -4610,7 +4610,7 @@
     <w:p/>
     <w:p>
       <w:r>
-        <w:t>– Vera, sa jeg. – Theo sto for tyveriet. Men lappene visste at vertshuset var kjøpt for brosjepengene, og det sto aldri i noe Blackburn-brev. Det er en eiendomsnotering. Et skjøte. Og skjøtet til dette vertshuset lå ute av skuffen sin i arkiveringskurven din i går morges, rørt ved, på skrivebordet til en kvinne som hadde sagt til meg to ganger at hun aldri leser arkivene som står bak henne. Jeg holdt stemmen myk. – Han sto for tyveriet. Du hadde skjøtet. Og du hadde beina, Vera. Han kunne ikke ha krysset denne byen ubemerket for sitt bare liv, alle kjenner Theo, alle stanser ham. Men ingen blunker over at ordførerens sekretær stikker innom vertshuset under festivalen. Jeg gikk forbi deg på trappen der den morges, med parkeringsbevisene dine. Han kunne ikke ha gjort det alene. Han trengte noen som kunne bevege seg gjennom byen usett. Det var deg.</w:t>
+        <w:t>– Vera, sa jeg. – Theo visste om tyveriet. Men lappene visste at vertshuset var kjøpt for brosjepengene, og det sto aldri i noe Blackburn-brev. Det er en eiendomsnotering. Et skjøte. Og skjøtet til dette vertshuset lå ute av skuffen sin i arkiveringskurven din i går morges, rørt ved, på skrivebordet til en kvinne som hadde sagt til meg to ganger at hun aldri leser arkivene som står bak henne. Jeg holdt stemmen myk. – Han visste om tyveriet. Du hadde skjøtet. Og du hadde beina, Vera. Han kunne ikke ha krysset denne byen ubemerket for sitt bare liv, alle kjenner Theo, alle stanser ham. Men ingen blunker over at ordførerens sekretær stikker innom vertshuset under festivalen. Jeg gikk forbi deg på trappen der den morges, med parkeringsbevisene dine. Han kunne ikke ha gjort det alene. Han trengte noen som kunne bevege seg gjennom byen usett. Det var deg.</w:t>
       </w:r>
     </w:p>
     <w:p/>
@@ -5092,7 +5092,7 @@
     <w:p/>
     <w:p>
       <w:r>
-        <w:t>Et øyeblikk senere kom Bram ilende over allmenningen mens han vred capsen i hendene, og bak ham kom selvfølgelig et reinsdyr. Dancer denne gangen, som hadde sluppet seg ut av innhegningen igjen og fulgt etter lyktene ned til byen. Hun ble stående midt på allmenningen med rim som glitret i geviret, og betraktet den oppgravde kobberboksen med mild og uforstyrret interesse mens hundre bysbarn stirret og en liten jente skrek høyt av ren lykke.</w:t>
+        <w:t>Et øyeblikk senere kom Bram ilende over allmenningen mens han vred capsen i hendene, og bak ham kom selvfølgelig et reinsdyr. Dancer denne gangen, som hadde sluppet seg ut av luftegården igjen og fulgt etter lyktene ned til byen. Hun ble stående midt på allmenningen med rim som glitret i geviret, og betraktet den oppgravde kobberboksen med mild og uforstyrret interesse mens hundre bysbarn stirret og en liten jente skrek høyt av ren lykke.</w:t>
       </w:r>
     </w:p>
     <w:p/>
@@ -5110,7 +5110,7 @@
     <w:p/>
     <w:p>
       <w:r>
-        <w:t xml:space="preserve">Jeg sto der på allmenningen og så meg rundt på alt sammen: almen og gullysene, den grønne kobberboksen, reinsdyret, det leende barnet og hele byen som sto samlet i lykteskjæret. Pip hadde gått bort for å stille seg like under snuten til Dancer og ga reinsdyret et langt, strengt blikk, som for å minne henne på hvem som eide denne pingvinen. Nicks hånd fant min. Utenfor innhegningen lå ildstedet han hadde bygget for magien, og jeg lurte på hvor mye mer av den som ville sirkulere der innen vi kom oss hjem.</w:t>
+        <w:t xml:space="preserve">Jeg sto der på allmenningen og så meg rundt på alt sammen: almen og gullysene, den grønne kobberboksen, reinsdyret, det leende barnet og hele byen som sto samlet i lykteskjæret. Pip hadde gått bort for å stille seg like under snuten til Dancer og ga reinsdyret et langt, strengt blikk, som for å minne henne på hvem som eide denne pingvinen. Nicks hånd fant min. Bortenfor luftegården lå ildstedet han hadde bygget for magien, og jeg lurte på hvor mye mer av den som ville sirkulere der innen vi kom oss hjem.</w:t>
       </w:r>
     </w:p>
     <w:p/>
@@ -5430,7 +5430,7 @@
     <w:p/>
     <w:p>
       <w:r>
-        <w:t>Nytt mel. Nytt vann. En innleid vekt. Like sur. Innen torsdag står Greta midt i sitt eget bakeri og forteller Jessica Claus at hendene hennes endelig har glemt hvordan man gjør det.</w:t>
+        <w:t>Nytt mel. Nytt vann. En lånt vekt. Like sur. Innen torsdag står Greta midt i sitt eget bakeri og forteller Jessica Claus at hendene hennes endelig har glemt hvordan man gjør det.</w:t>
       </w:r>
     </w:p>
     <w:p/>
@@ -5442,7 +5442,7 @@
     <w:p/>
     <w:p>
       <w:r>
-        <w:t xml:space="preserve">Byen griper etter de enkle forklaringene: slakteren som lenket fast lasteporten, familien som lå etter med oljeregningen, en gutt som kjedet seg, med en stjålet boks. Jessica griper etter det som passer – for hvem enn som gjorde dette, kjøpte pulveret, kjente doseringen og sendte inn en klage som viste til helseforskriften med underparagraf. Det er ikke et raserianfall. Det er et fag.</w:t>
+        <w:t xml:space="preserve">Byen griper etter de enkle forklaringene: slakteren som lenket fast lasteporten, familien som lå etter med oljeregningen, en gutt som kjedet seg, med en stjålet sprayboks. Jessica griper etter det som passer – for hvem enn som gjorde dette, kjøpte pulveret, kjente doseringen og sendte inn en klage som viste til helseforskriften med underparagraf. Det er ikke et raserianfall. Det er et fag.</w:t>
       </w:r>
     </w:p>
     <w:p/>
@@ -5739,7 +5739,7 @@
     </w:p>
     <w:p>
       <w:r>
-        <w:t>– Intet skilt. Ikke noe navn på tillatelsestavlen heller ennå, jeg sjekket. Men det står en container i smauet, og det sto en varebil der på lørdag, og man leier ikke en container med mindre man rømmer ut et lokale.</w:t>
+        <w:t>– Intet skilt. Ikke noe navn på tillatelsestavlen heller ennå, jeg sjekket. Men det står en container i smauet, og det sto en varebil der på lørdag, og man leier ikke en container med mindre man rydder ut et lokale.</w:t>
       </w:r>
     </w:p>
     <w:p/>

</xml_diff>

<commit_message>
Full proofcheck Inn Trouble Norwegian: SIGNIFICANT (61 edits)
Co-Authored-By: Claude Opus 5.5 <noreply@anthropic.com>
Claude-Session: https://claude.ai/code/session_012Cm8JxdqzjuttdUSdkQCUg
</commit_message>
<xml_diff>
--- a/translated/corrected/Inn Trouble - ASSEMBLED - FORMATTED_Norwegian.docx
+++ b/translated/corrected/Inn Trouble - ASSEMBLED - FORMATTED_Norwegian.docx
@@ -115,13 +115,13 @@
     <w:p/>
     <w:p>
       <w:r>
-        <w:t>Winter Wonderland Inn har varmet opp halvparten av Frost Falls opp gjennom årene. Fiona Okafor har drevet det slik familien hennes har drevet det i hundre år, og i morges har hun kneppet cardiganen feil og klarer ikke å slutte å stirre på døren.</w:t>
-      </w:r>
-    </w:p>
-    <w:p/>
-    <w:p>
-      <w:r>
-        <w:t>Lappen krever en halv million dollar. Den vet hva oldemoren hennes tok fra Blackburn-familien i 1924, og butikken to byer unna der hun solgte den, og den nevner safiren i hjertet av brosjen – detaljer som finnes i nøyaktig én låst kiste på Fionas loft, og ett annet sted i byen.</w:t>
+        <w:t>Winter Wonderland Inn har varmet opp halvparten av Frost Falls opp gjennom årene. Fiona Okafor har drevet det slik familien hennes har drevet det i hundre år, og i morges har hun kneppet kardiganen feil og klarer ikke å slutte å stirre på døren.</w:t>
+      </w:r>
+    </w:p>
+    <w:p/>
+    <w:p>
+      <w:r>
+        <w:t>Lappen krever en halv million dollar. Den vet hva oldemoren hennes tok fra Blackburn-familien i 1924, og butikken to byer unna der hun solgte den, og den nevner steinen i hjertet av brosjen – detaljer som finnes i nøyaktig én låst kiste på Fionas loft, og ett annet sted i byen.</w:t>
       </w:r>
     </w:p>
     <w:p/>
@@ -278,7 +278,7 @@
     </w:p>
     <w:p>
       <w:r>
-        <w:t xml:space="preserve">Det var Sam Patel denne gangen, som rygget inn med en kasse full av jern i armene, og verandabrakettene klirret dempet mot hverandre mens han snudde seg og satte dem fra seg ved disken med et stønn. Sam var en stor, omhyggelig mann med sot som hadde satt seg så langt inn i foldene på knokene at jeg tvilte på at såpe kunne nå dem lenger, og vanligvis hadde han en håndverkers rolige fatning. Det fantes ikke noe igjen av den nå. Han krysset gulvet mot Fiona med fast stram kjeve.</w:t>
+        <w:t xml:space="preserve">Det var Sam Patel denne gangen, som rygget inn med en kasse full av jern i armene, og verandabrakettene klirret dempet mot hverandre mens han snudde seg og satte dem fra seg ved disken med et stønn. Sam var en stor, omhyggelig mann med sot som hadde satt seg så langt inn i foldene på knokene at jeg tvilte på at såpe kunne nå dem lenger, og vanligvis hadde han en håndverkers rolige fatning. Det fantes ikke noe igjen av den nå. Han krysset gulvet mot Fiona med sammenbitte kjever.</w:t>
       </w:r>
     </w:p>
     <w:p>
@@ -428,7 +428,7 @@
     </w:p>
     <w:p>
       <w:r>
-        <w:t>Og det var noe som var galt med venninnen min, alvorlig galt, galt nok til å legge skygger under øynene hennes og et vaktsomt blikk i ansiktet hennes. Det hadde med en brosje å gjøre. Og en fremmed med et godt smil og en notisbok hadde kommet til en liten by for nøyaktig å spørre om det.</w:t>
+        <w:t>Og det var noe som var galt med venninnen min, alvorlig galt, galt nok til å legge skygger under øynene hennes og et vaktsomt blikk i ansiktet hennes. Det hadde med en brosje å gjøre. Og en fremmed med et godt smil og en notisbok hadde kommet til en liten by for å spørre om nettopp det.</w:t>
       </w:r>
     </w:p>
     <w:p>
@@ -539,7 +539,7 @@
         <w:rPr>
           <w:i/>
         </w:rPr>
-        <w:t xml:space="preserve">Jeg vet hvordan familien din kom over dette vertshuset. Jeg vet om brosjen oldemor tok fra Blackburn-familien, den med safiren i hjertet, og butikken i Ridgeline der hun solgte den for å kjøpe dette stedet. Betal, eller hele byen får vite sannheten. Legg pengene under vertshusets inngangstrapp. Ta ned gullbåndet på kransen og heng opp et rødt i stedet, så jeg vet at pengene er der.</w:t>
+        <w:t xml:space="preserve">Jeg vet hvordan familien din kom over dette vertshuset. Jeg vet om brosjen oldemoren din tok fra Blackburn-familien, den med safiren i hjertet, og butikken i Ridgeline der hun solgte den for å kjøpe dette stedet. Betal, eller hele byen får vite sannheten. Legg pengene under vertshusets inngangstrapp. Ta ned gullbåndet på kransen og heng opp et rødt i stedet, så jeg vet at pengene er der.</w:t>
       </w:r>
     </w:p>
     <w:p>
@@ -708,7 +708,7 @@
     </w:p>
     <w:p>
       <w:r>
-        <w:t>Noe som etterlot det andre.</w:t>
+        <w:t>Da gjensto bare det andre.</w:t>
       </w:r>
     </w:p>
     <w:p>
@@ -1098,7 +1098,7 @@
     </w:p>
     <w:p>
       <w:r>
-        <w:t xml:space="preserve">– Jeg er alltid på jakt etter brosjen min. Det er jobben. Han rettet seg opp og stakk notatblokken under armen. – En mann kom bort til meg ved eplemostbordet i stad og fortalte at Blackburns en gang eide halvparten av Maple Street. Visste du det? Folk elsker å fortelle hva de rike familiene eide. De kan aldri fortelle deg hva de rike familiene gjorde mot dem som arbeidet for dem. Den biten kommer ikke med i familiepapirene. Han nikket mot glasset. – Rart det der. Tyve år med brev og ikke ett eneste skrevet av en stuepike.</w:t>
+        <w:t xml:space="preserve">– Jeg er alltid på jakt etter brosjen min. Det er jobben. Han rettet seg opp og stakk notatblokken under armen. – En mann kom bort til meg ved eplemostbordet i stad og fortalte at Blackburn-familien en gang eide halvparten av Maple Street. Visste du det? Folk elsker å fortelle hva de rike familiene eide. De kan aldri fortelle deg hva de rike familiene gjorde mot dem som arbeidet for dem. Den biten kommer ikke med i familiepapirene. Han nikket mot glasset. – Rart det der. Tyve år med brev og ikke ett eneste skrevet av en stuepike.</w:t>
       </w:r>
     </w:p>
     <w:p>
@@ -1178,12 +1178,12 @@
     </w:p>
     <w:p>
       <w:r>
-        <w:t>Brevene hadde vært her. Papiret hadde vært her.</w:t>
-      </w:r>
-    </w:p>
-    <w:p>
-      <w:r>
-        <w:t>Det jeg måtte finne nå, var hvem som hadde vært her i stillheten, etter at dørene var låst og kassene stod uovervåket, og lest en hundre år gammel hemmelighet i lampelys for så å beslutte seg for å selge den.</w:t>
+        <w:t>Brevene hadde vært her. Papiret var her.</w:t>
+      </w:r>
+    </w:p>
+    <w:p>
+      <w:r>
+        <w:t>Det jeg måtte finne nå, var hvem som hadde vært her i stillheten, etter at dørene var låst og eskene stod uovervåket, og lest en hundre år gammel hemmelighet i lampelys for så å beslutte seg for å selge den.</w:t>
       </w:r>
     </w:p>
     <w:p>
@@ -1338,7 +1338,7 @@
     <w:p/>
     <w:p>
       <w:r>
-        <w:t>Jeg mistenkte ham. En mann som var så desperat, som hadde tilbrakt nettene alene blant Blackburn-eskene, som hadde reist seg foran hele byen og sagt at de mest interessante brevene var kommet på villspor. Jeg ville være sikker, og jeg tvang meg til å vente.</w:t>
+        <w:t>Jeg mistenkte ham. En mann som var så desperat, som hadde tilbrakt nettene alene blant Blackburn-eskene, som hadde reist seg foran hele byen og sagt at de mest interessante brevene var kommet på avveie. Jeg ville være sikker, og jeg tvang meg til å vente.</w:t>
       </w:r>
     </w:p>
     <w:p/>
@@ -1422,7 +1422,7 @@
     <w:p/>
     <w:p>
       <w:r>
-        <w:t>– Sørg for at du gjør det. Og så gikk hun tilbake til votten sin som om hun ikke akkurat hadde gitt meg en bit av verden.</w:t>
+        <w:t>– Sørg for at du gjør det. Og så gikk hun tilbake til votten sin som om hun ikke nettopp hadde gitt meg noe som helst.</w:t>
       </w:r>
     </w:p>
     <w:p/>
@@ -1552,7 +1552,7 @@
     <w:p/>
     <w:p>
       <w:r>
-        <w:t>– Hvordan går det med deg, Mark? spurte jeg lavt neste gang vi passerte hverandre, mens Emma holdt på å forhandle frem en skjør fred mellom Snowball og et gresskar som hadde fornærmet ham.</w:t>
+        <w:t>– Hvordan går det med deg, Mark? spurte jeg lavt neste gang vi passerte hverandre, mens Emma holdt på å forhandle frem en skjør fred mellom Snowball og et pyntegresskar som hadde fornærmet ham.</w:t>
       </w:r>
     </w:p>
     <w:p/>
@@ -1576,7 +1576,7 @@
     <w:p/>
     <w:p>
       <w:r>
-        <w:t xml:space="preserve">Vottene lå fremdeles i vesken min. Jeg lette opp den som ledde komiteen, og fant politisjefen. Noriko Tanaka stod midt på allmenningen i parkas og ulllue, med en klipsholder i den ene hånden og et termokrus i den andre, og dirigerte folk dit det trengtes. Hun var en tettbygd kvinne i femtiårene med gråsprengt hår ved tinningene og en slitt notisblokk som stakk opp av jakkelommen. Olivia hadde fortalt meg at hun hadde kommet hjem etter tjue år i statspolitiet for å lede en avdeling på seks personer, og at ingen i Frost Falls noensinne hadde hørt henne heve stemmen.</w:t>
+        <w:t xml:space="preserve">Vottene lå fremdeles i vesken min. Jeg lette etter den som ledet komiteen, og fant politisjefen. Noriko Tanaka stod midt på allmenningen i parkas og ulllue, med en klipsholder i den ene hånden og et termokrus i den andre, og dirigerte folk dit det trengtes. Hun var en tettbygd kvinne på rundt femti med gråsprengt hår ved tinningene og en slitt notisblokk som stakk opp av jakkelommen. Olivia hadde fortalt meg at hun hadde kommet hjem etter tjue år i statspolitiet for å lede en avdeling på seks personer, og at ingen i Frost Falls noensinne hadde hørt henne heve stemmen.</w:t>
       </w:r>
     </w:p>
     <w:p/>
@@ -1666,7 +1666,7 @@
     <w:p/>
     <w:p>
       <w:r>
-        <w:t xml:space="preserve">Så rettet jeg meg opp. Det lå fremdeles en utpressingslapp brettet sammen i kåpen min, et styremøte i vente og en sliten mann blant alle esker og kasser.</w:t>
+        <w:t xml:space="preserve">Så rettet jeg meg opp. Det lå fremdeles en utpressingslapp brettet sammen i kåpen min, et styremøte i vente og en sliten mann blant eskene sine.</w:t>
       </w:r>
     </w:p>
     <w:p/>
@@ -1838,7 +1838,7 @@
     <w:p/>
     <w:p>
       <w:r>
-        <w:t>– Du gjorde jobben på vertshuset, sa jeg avslappet mens jeg snudde staken. – Alt det jernarbeidet i Fionas foajé. Stjernene på peishyllen, lampettene, gnistfangeren.</w:t>
+        <w:t>– Du gjorde jobben på vertshuset, sa jeg avslappet mens jeg snudde staken. – Alt det jernarbeidet i Fionas foajé. Stjernene på peishyllen, lampettene, peisskjermen.</w:t>
       </w:r>
     </w:p>
     <w:p/>
@@ -1862,7 +1862,7 @@
     <w:p/>
     <w:p>
       <w:r>
-        <w:t>Jeg betraktet ham mens han sa det. Jeg har brukt et langt liv på å lære å skille mennene som kan vise følelser fra dem som bare har det ene ansiktet, og Sam Patel som fortalte meg om tjue dollar, var en mann med bare det ene ansiktet, der all smerten lå oppe i dagen der flammene fanget den. Sinnet hans var en venns sinne, mest av alt såret, uten et gram av en utpressers kalde beregning i seg.</w:t>
+        <w:t>Jeg betraktet ham mens han sa det. Jeg har brukt et langt liv på å lære å skille mennene som kan ta på seg en følelse, fra dem som bare har det ene ansiktet, og Sam Patel som fortalte meg om tjue dollar, var en mann med bare det ene ansiktet, der all smerten lå oppe i dagen der flammene fanget den. Sinnet hans var en venns sinne, mest av alt såret, uten et gram av en utpressers kalde beregning i seg.</w:t>
       </w:r>
     </w:p>
     <w:p/>
@@ -1892,7 +1892,7 @@
     <w:p/>
     <w:p>
       <w:r>
-        <w:t>– Denne gamle historien hennes, hvis det da er en historie, sa jeg så lett som jeg kunne. – Vet du noe om de første dagene til vertshuset? Hvordan Fionas familie endte opp med å eie det, for lenge siden? Noen gammel historie som har gått i arv?</w:t>
+        <w:t>– Dette gamle trøbbelet hennes, hvis det da er trøbbel, sa jeg så lett som jeg kunne. – Vet du noe om de første dagene til vertshuset? Hvordan Fionas familie endte opp med å eie det, for lenge siden? Noen gammel historie som har gått i arv?</w:t>
       </w:r>
     </w:p>
     <w:p/>
@@ -2394,7 +2394,7 @@
     <w:p/>
     <w:p>
       <w:r>
-        <w:t>Hun tok imot dette som intet mindre enn det hun hadde krav på, kastet et megetsigende blikk mot skapet der sardinene ble oppbevart, og fikk en.</w:t>
+        <w:t>Hun tok imot dette som intet annet enn det hun hadde krav på, kastet et megetsigende blikk mot skapet der sardinene ble oppbevart, og fikk en.</w:t>
       </w:r>
     </w:p>
     <w:p/>
@@ -2417,7 +2417,7 @@
     <w:p/>
     <w:p>
       <w:r>
-        <w:t xml:space="preserve">Foajéen var dekorert med portretter av tidligere ordførere, gullinnrammede og selvgode, og et oppsiktsvekkende antall av dem var Blackburner, med den samme lange Blackburn-nesen arvet nedover veggen som et stykke familiesølv. Innerst i foajéen stod døren til den nåværende ordføreren åpen. Bak et bredt, rent skrivebord som ikke inneholdt annet enn en telefon og et skriveunderlag i lær, satt ordføreren selv, en glatt, grå mann som hadde arvet nesen, embetet og, så vidt noen i byen kunne bedømme, lite annet.</w:t>
+        <w:t xml:space="preserve">Foajeen var dekorert med portretter av tidligere ordførere, gullinnrammede og selvgode, og et oppsiktsvekkende antall av dem var Blackburner, med den samme lange Blackburn-nesen arvet nedover veggen som et stykke familiesølv. Innerst i foajeen stod døren til den nåværende ordføreren åpen. Bak et bredt, rent skrivebord som ikke inneholdt annet enn en telefon og et skriveunderlag i lær, satt ordføreren selv, en glatt, grå mann som hadde arvet nesen, embetet og, så vidt noen i byen kunne bedømme, lite annet.</w:t>
       </w:r>
     </w:p>
     <w:p/>
@@ -2683,7 +2683,7 @@
     <w:p/>
     <w:p>
       <w:r>
-        <w:t xml:space="preserve">Jeg så på ham mens han sa det. Jeg så en mann drukne midt på lys dag, i et kaldt rom, foran menneskene som elsket det han elsket, og som sa det høyt med vannet allerede opp til haken. Jeg hadde kommet til det møtet og fremdeles halvt håpet at mannen jeg mistenkte, på et eller annet vis ville vise seg å være en annen enn denne. Det gjorde han ikke. Han var nøyaktig denne. En god mann ved den absolutte enden av sin tålmodighet, som så laget han hadde gitt sitt liv til, gå under for mangel på penger, mens flekken bredte seg utover taket og blikkbøtten fanget opp regnet.</w:t>
+        <w:t xml:space="preserve">Jeg så på ham mens han sa det. Jeg så en mann drukne midt på lys dag, i et kaldt rom, foran menneskene som elsket det han elsket, og som sa det høyt med vannet allerede opp til haken. Jeg hadde kommet til det møtet og fremdeles halvt håpet at mannen jeg mistenkte, på et eller annet vis ville vise seg å være en annen enn denne. Det gjorde han ikke. Han var nøyaktig denne. En god mann som var kommet helt til veis ende, som så laget han hadde gitt sitt liv til, gå under for mangel på penger, mens flekken bredte seg utover taket og blikkbøtten fanget opp regnet.</w:t>
       </w:r>
     </w:p>
     <w:p/>
@@ -2695,7 +2695,7 @@
     <w:p/>
     <w:p>
       <w:r>
-        <w:t xml:space="preserve">Vera var der også, i hjørnet, og tok referat. Ordførerkontoret sendte en person for å referere fra møtene til de organene det finansierte, og denne personen var Vera, med stenoblokken sin og den tilknappede cardiganen, som skrev alt ned med sin nette, raske hånd. Jeg så på henne også, når jeg kunne gjøre det uten å bli sett. Hun skrev ned tallene uten å mine en mine. Men da Theo sa det om å være ynkelig, om det vennlige brevet som sa nei, stoppet pennen hennes opp et øyeblikk. Kjeven strammet seg. Hun så opp på den brune flekken i taket, og det som fløy over ansiktet hennes, lå tett opp til sorg, eller frykt, eller begge deler på en gang. Jeg klarte ikke å tenke på hva en kvinne kunne sørge over eller frykte på et styremøte der hun bare var til stede for å skrive referat.</w:t>
+        <w:t xml:space="preserve">Vera var der også, i hjørnet, og tok referat. Ordførerkontoret sendte en person for å referere fra møtene til de organene det finansierte, og denne personen var Vera, med stenoblokken sin og den tilknappede kardiganen, som skrev alt ned med sin nette, raske hånd. Jeg så på henne også, når jeg kunne gjøre det uten å bli sett. Hun skrev ned tallene uten å mine en mine. Men da Theo sa det om å være ynkelig, om det vennlige brevet som sa nei, stoppet pennen hennes opp et øyeblikk. Kjeven strammet seg. Hun så opp på den brune flekken i taket, og det som fløy over ansiktet hennes, lå tett opp til sorg, eller frykt, eller begge deler på en gang. Jeg klarte ikke å tenke på hva en kvinne kunne sørge over eller frykte på et styremøte der hun bare var til stede for å skrive referat.</w:t>
       </w:r>
     </w:p>
     <w:p/>
@@ -2897,7 +2897,7 @@
     <w:p/>
     <w:p>
       <w:r>
-        <w:t>– Morgen, fru Claus, sa Greta. – Ikke bry deg om kula. Den har holdt på sånn siden daggry. – Hun skjøv bollene mine over disken. – Det er den store mikseren, tror jeg. Den rister i hele disken.</w:t>
+        <w:t>– Morgen, fru Claus, sa Greta. – Ikke bry deg om kula. Den har holdt på sånn siden daggry. Hun skjøv bollene mine over disken. – Det er den store mikseren, tror jeg. Den rister i hele disken.</w:t>
       </w:r>
     </w:p>
     <w:p/>
@@ -2927,7 +2927,7 @@
     <w:p/>
     <w:p>
       <w:r>
-        <w:t>– Fru Claus! Han snudde seg ikke en gang. – Det er Prancer denne gangen! Prancer! Hun er nedi fontenen, og det er ikke engang vann i den, og hun vil ikke ut, og det samler seg en folkemengde, og jeg har prøvd alt, jeg har prøvd sukker, jeg har prøvd strenghet, jeg har prøvd å resonnere med henne, noe jeg innrømmer var i overkant optimistisk. – Han dro, og Prancer møtte ham med den suverene likegyldigheten til et vesen som ikke hadde noen som helst intensjon om å flytte på seg. – To av dem ute nå. To! Prancer i fontenen, og Vixen har kommet seg inn i kirkesalen på et vis og spist halmen ut av julekrybben, og hun angrer ikke en gang, du kan se at hun ikke angrer, se på henne, å nei, hun er ikke her, hun er i kirken, men hvis hun hadde vært her, ville du sett at hun ikke angrer.</w:t>
+        <w:t>– Fru Claus! Han snudde seg ikke en gang. – Det er Prancer denne gangen! Prancer! Hun er nedi fontenen, og det er ikke engang vann i den, og hun vil ikke ut, og det samler seg en folkemengde, og jeg har prøvd alt, jeg har prøvd sukker, jeg har prøvd strenghet, jeg har prøvd å resonnere med henne, noe jeg innrømmer var i overkant optimistisk. Han dro, og Prancer møtte ham med den suverene likegyldigheten til et vesen som ikke hadde noen som helst intensjon om å flytte på seg. – To av dem ute nå. To! Prancer i fontenen, og Vixen har kommet seg inn i kirkesalen på et vis og spist halmen ut av julekrybben, og hun angrer ikke en gang, du kan se at hun ikke angrer, se på henne, å nei, hun er ikke her, hun er i kirken, men hvis hun hadde vært her, ville du sett at hun ikke angrer.</w:t>
       </w:r>
     </w:p>
     <w:p/>
@@ -2969,7 +2969,7 @@
     <w:p/>
     <w:p>
       <w:r>
-        <w:t>– Det må du nesten spørre ham om, sa jeg. – Men de kjenner det lang vei, akkurat som lysene. Alt trekker i samme retning, Bram. Hjemover. – Jeg så Prancer runde svingen og forsvinne opp stien. – Hun blir kalt på.</w:t>
+        <w:t>– Det må du nesten spørre ham om, sa jeg. – Men de kjenner det lang vei, akkurat som lysene. Alt trekker i samme retning, Bram. Hjemover. Jeg så Prancer runde svingen og forsvinne opp stien. – Hun blir kalt på.</w:t>
       </w:r>
     </w:p>
     <w:p/>
@@ -2981,7 +2981,7 @@
     <w:p/>
     <w:p>
       <w:r>
-        <w:t xml:space="preserve">– Kalt hjem, sa han. – Jaja. Det er vel ikke det verste en skapning kan foreta seg. Eller en alv. – Han sukket. – Da får jeg gå og hente Vixen ut fra kirken før hun spiser opp julefigurene. – Han luntet av sted og mumlet for seg selv. Folkemengden spredte seg, barna sto fremdeles og pekte oppover stien, og herr Kim klappet sammen stolen sin, reint fornøyd.</w:t>
+        <w:t xml:space="preserve">– Kalt hjem, sa han. – Jaja. Det er vel ikke det verste en skapning kan foreta seg. Eller en alv. Han sukket. – Da får jeg gå og hente Vixen ut fra kirken før hun spiser opp julefigurene. Han luntet av sted og mumlet for seg selv. Folkemengden spredte seg, barna sto fremdeles og pekte oppover stien, og herr Kim klappet sammen stolen sin, reint fornøyd.</w:t>
       </w:r>
     </w:p>
     <w:p/>
@@ -3153,7 +3153,7 @@
     </w:p>
     <w:p>
       <w:r>
-        <w:t xml:space="preserve">Vi arbeidet til lyset forsvant. Ved femtiden seg hyssingen over disken ned på midten, og det var ni par igjen i kurvene. Ellie tok med seg tre par hjem og Ivy tok to. Den siste vrangborden på pinnene mine lød MAXIMILIAN i grønt og hvitt, og jeg måtte legge den flatt på kneet for å få plass til hver bokstav rundt.</w:t>
+        <w:t xml:space="preserve">Vi arbeidet til lyset forsvant. Ved femtiden seig hyssingen over disken ned på midten, og det var ni par igjen i kurvene. Ellie tok med seg tre par hjem og Ivy tok to. Den siste vrangborden på pinnene mine lød MAXIMILIAN i grønt og hvitt, og jeg måtte legge den flatt på kneet for å få plass til hver bokstav rundt.</w:t>
       </w:r>
     </w:p>
     <w:p>
@@ -3240,7 +3240,7 @@
     </w:p>
     <w:p>
       <w:r>
-        <w:t xml:space="preserve">– Da gjenstår det to. Jeg så på papiret og hadde ikke lyst til det. Vera. Theo. De to navnene jeg ikke klarte å sette en strek over. – Og det er dette som bekymrer meg. Av alle på denne listen er de eneste to jeg ikke kan frikjenne, de to som sitter på nøklene til byens gamle papirarkiv. Vera tar seg av skjøte- og eiendomsregistrene, et århundre med hvem-eide-hva, og vertshusets skjøte ligger et sted blant dem. Hun ble stiv som en pinne og fortalte meg at hun aldri leser de samme papirene som står rett bak ryggen hennes. Og Theo. Jeg tvang meg til å si det sakte. – Theo bor i arkivet. Blackburn-brevene var i hans varetekt, i hans hender. Og de mest interessante av dem, nettopp de som ville røpet at en brosje forsvant og hvor den tok veien, er de som han stilte seg opp foran hele byen og kunngjorde hadde kommet på avveie.</w:t>
+        <w:t xml:space="preserve">– Da gjenstår det to. Jeg så på papiret og hadde ikke lyst til det. Vera. Theo. De to navnene jeg ikke klarte å sette en strek over. – Og det er dette som bekymrer meg. Av alle på denne listen er de eneste to jeg ikke kan frikjenne, de to som sitter på nøklene til byens gamle papirarkiv. Vera tar seg av skjøte- og eiendomsregistrene, et århundre med hvem-eide-hva, og vertshusets skjøte ligger et sted blant dem. Hun ble stiv som en pinne og fortalte meg at hun aldri leser nettopp de papirene som står rett bak ryggen hennes. Og Theo. Jeg tvang meg til å si det sakte. – Theo bor i arkivet. Blackburn-brevene var i hans varetekt, i hans hender. Og de mest interessante av dem, nettopp de som ville røpet at en brosje forsvant og hvor den tok veien, er de som han stilte seg opp foran hele byen og kunngjorde hadde kommet på avveie.</w:t>
       </w:r>
     </w:p>
     <w:p>
@@ -3297,7 +3297,7 @@
     <w:p/>
     <w:p>
       <w:r>
-        <w:t>Han var ikke i smia. Han var på vertshuset og sto på en stige på verandaen for å henge opp de siste jernbeslagene, med en munnfull skruer og et vaterpass balansert på rekkverket. Han kom ned da han fikk øye på meg på gangveien, vaktsom. Sist vi hadde snakket sammen, hadde jeg kretset rundt ham uten å si det høyt, og det hadde han merket, om han så ikke kunne ha satt ord på det.</w:t>
+        <w:t>Han var ikke i smia. Han var på vertshuset og sto på en stige på verandaen for å henge opp de siste jernbrakettene, med en munnfull skruer og et vaterpass balansert på rekkverket. Han kom ned da han fikk øye på meg på gangveien, vaktsom. Sist vi hadde snakket sammen, hadde jeg kretset rundt ham uten å si det høyt, og det hadde han merket, om han så ikke kunne ha satt ord på det.</w:t>
       </w:r>
     </w:p>
     <w:p/>
@@ -3357,7 +3357,7 @@
     <w:p/>
     <w:p>
       <w:r>
-        <w:t>Lukten på lappen hadde aldri vært Sams. Det hadde vært arbeidet hans. En smed gjør ferdig jern ved å brenne olje inn i det mens det fremdeles er varmt, og nytt jernarbeid bærer preg av den røyken i ukesvis. Fionas foajé var full av den, trapperekkverket, peisskjermen, beslagene som ble hengt opp på verandaen, og Sams jakke og verktøyveske hadde hengt ved døren hennes hver dag i tre uker. Hvert eneste papir som lå på det skrivebordet, tok til seg lukten. Lappen hadde ligget der den også. Sporet som hadde plassert ham øverst på listen min, hadde hele tiden fortalt meg hvor lappen hadde ligget. Ikke hvem som hadde skrevet den. Jeg hadde lest det baklengs. Nå kunne jeg lese det riktig vei, og riktig vei frikjente ham fullstendig.</w:t>
+        <w:t>Lukten på lappen hadde aldri vært Sams. Det hadde vært arbeidet hans. En smed gjør ferdig jern ved å brenne olje inn i det mens det fremdeles er varmt, og nytt jernarbeid bærer preg av den røyken i ukesvis. Fionas foajé var full av den, trapperekkverket, peisskjermen, brakettene som ble hengt opp på verandaen, og Sams jakke og verktøyveske hadde hengt ved døren hennes hver dag i tre uker. Hvert eneste papir som lå på det skrivebordet, tok til seg lukten. Lappen hadde ligget der den også. Sporet som hadde plassert ham øverst på listen min, hadde hele tiden fortalt meg hvor lappen hadde ligget. Ikke hvem som hadde skrevet den. Jeg hadde lest det baklengs. Nå kunne jeg lese det riktig vei, og riktig vei frikjente ham fullstendig.</w:t>
       </w:r>
     </w:p>
     <w:p/>
@@ -3375,7 +3375,7 @@
     <w:p/>
     <w:p>
       <w:r>
-        <w:t>Jeg lovet at jeg skulle gjøre det, begge deler, og jeg lot ham holde på med beslagene sine. Pip ga opp skruene med en viss motvilje, og hun og jeg gikk tilbake opp den lyse, kalde gaten. Et sted mellom vertshuset og hjørnet strøk jeg Sam Patel av listen i hodet mitt, og var glad for det. Nok et navn borte. Nok en god mann som i det øyeblikket jeg slapp ham inn, gikk fra å være en sprekk i muren rundt Fiona til å bli enda en av dens faste steiner.</w:t>
+        <w:t>Jeg lovet at jeg skulle gjøre det, begge deler, og jeg lot ham holde på med brakettene sine. Pip ga opp skruene med en viss motvilje, og hun og jeg gikk tilbake opp den lyse, kalde gaten. Et sted mellom vertshuset og hjørnet strøk jeg Sam Patel av listen i hodet mitt, og var glad for det. Nok et navn borte. Nok en god mann som i det øyeblikket jeg slapp ham inn, gikk fra å være en sprekk i muren rundt Fiona til å bli enda en av dens faste steiner.</w:t>
       </w:r>
     </w:p>
     <w:p/>
@@ -3470,7 +3470,7 @@
     <w:p/>
     <w:p>
       <w:r>
-        <w:t xml:space="preserve">– Hun hadde penger til gode, sa Neil mens han så på at jeg leste. – Det er den biten slarvet alltid utelater, fordi slarv vil ha en ren og pen skurk og en ren og pen forbrytelse. Blackburn-familien hadde ikke betalt husholdningspersonalet sitt på måneder, den vinteren i tjuefire. Jeg har klagene der inne, de andre tjenestefolkene som gikk sin veg, og et brev, fru Claus, et brev fra Constance selv, der hun ber, svært høflig, om den ubetalte lønnen sin, og får til svar at hun skal være takknemlig for at hun har et tak over hodet. Moren hennes lå for døden den samme vinteren, tre gater unna, og det fantes ikke penger til lege, ikke en cent. Og der var hun, dag etter dag, og tørket støv av en brosje som var verdt mer enn hun ville tjene på tre livstider, mens familien som eide den, ba henne være takknemlig. Han bredde ut hendene. – Jeg sier ikke at hun gjorde rett i å ta den. Jeg sier at hun ikke var en tyv på den enkle måten lappen vil ha venninnen din til å tro at hun var. Hun var en desperat jente, ranet først av rike mennesker som hadde råd til å betale henne og valgte å la være. Hun betalte seg selv tilbake med det eneste hun kunne nå, og bygget hundre år med ærlig gjestfrihet oppå det. Det finnes verre fundamenter for et vertshus.</w:t>
+        <w:t xml:space="preserve">– Hun hadde penger til gode, sa Neil mens han så på at jeg leste. – Det er den biten slarvet alltid utelater, fordi slarv vil ha en ren og pen skurk og en ren og pen forbrytelse. Blackburn-familien hadde ikke betalt husholdningspersonalet sitt på måneder, den vinteren i tjuefire. Jeg har klagene der inne, de andre tjenestefolkene som gikk sin vei, og et brev, fru Claus, et brev fra Constance selv, der hun ber, svært høflig, om den ubetalte lønnen sin, og får til svar at hun skal være takknemlig for at hun har et tak over hodet. Moren hennes lå for døden den samme vinteren, tre gater unna, og det fantes ikke penger til lege, ikke en cent. Og der var hun, dag etter dag, og tørket støv av en brosje som var verdt mer enn hun ville tjene på tre livstider, mens familien som eide den, ba henne være takknemlig. Han bredde ut hendene. – Jeg sier ikke at hun gjorde rett i å ta den. Jeg sier at hun ikke var en tyv på den enkle måten lappen vil ha venninnen din til å tro at hun var. Hun var en desperat jente, ranet først av rike mennesker som hadde råd til å betale henne og valgte å la være. Hun betalte seg selv tilbake med det eneste hun kunne nå, og bygget hundre år med ærlig gjestfrihet oppå det. Det finnes verre fundamenter for et vertshus.</w:t>
       </w:r>
     </w:p>
     <w:p/>
@@ -3795,7 +3795,7 @@
     <w:p/>
     <w:p>
       <w:r>
-        <w:t>– Den lå på resepsjonsskranken, sa hun i det øyeblikket jeg kom gjennom døren. Hun hadde stengt oss inne i den lille stuen igjen, og hun holdt lappen ut på utstrakt arm, klemt fast mellom to fingre, som om den kunne snu seg og bite henne. – Bare lå der. Blant morgenposten, som en gassregning. Jessica, han har gått inn i foajeen min. Han sto ved mitt eget skrivebord. Det kunne ha vært hvem som helst, hvem som helst av gjestene, hvem som helst av de dussinvis av menneskene som har rent ut og inn hele dagen for festivalen, og han sto akkurat der hvor jeg sjekker inn folk, og la den fra seg blant brevene mine og gikk sin veg, og jeg så det aldri.</w:t>
+        <w:t>– Den lå på resepsjonsskranken, sa hun i det øyeblikket jeg kom gjennom døren. Hun hadde stengt oss inne i den lille stuen igjen, og hun holdt lappen ut på utstrakt arm, klemt fast mellom to fingre, som om den kunne snu seg og bite henne. – Bare lå der. Blant morgenposten, som en gassregning. Jessica, han har gått inn i foajeen min. Han sto ved mitt eget skrivebord. Det kunne ha vært hvem som helst, hvem som helst av gjestene, hvem som helst av de dussinvis av menneskene som har rent ut og inn hele dagen for festivalen, og han sto akkurat der hvor jeg sjekker inn folk, og la den fra seg blant brevene mine og gikk sin vei, og jeg så det aldri.</w:t>
       </w:r>
     </w:p>
     <w:p/>
@@ -3891,7 +3891,7 @@
         <w:rPr>
           <w:i/>
         </w:rPr>
-        <w:t>Han har gått inn i foajeen min. Han sto ved mitt eget skrivebord. Han la den fra seg blant brevene mine og gikk sin veg, og jeg så det aldri.</w:t>
+        <w:t>Han har gått inn i foajeen min. Han sto ved mitt eget skrivebord. Han la den fra seg blant brevene mine og gikk sin vei, og jeg så det aldri.</w:t>
       </w:r>
       <w:r>
         <w:t xml:space="preserve"> Jeg forsøkte å plassere mannen jeg nå trodde hadde skrevet den, inn i det bildet, forsøkte å se for meg hvordan han krysset den travle foajeen i fullt dagslys, la en konvolutt på resepsjonsskranken og spaserte ut uten at noen la merke til det. Og jeg klarte ikke å få bildet til å henge sammen. Ikke for hans del. Han var altfor kjent i denne byen, altfor overvåket, altfor ofte stanset på hvert eneste gatehjørne. Han kunne ikke krysse et rom i Frost Falls uten at fire mennesker grep ham i ermet for å krangle om grunnleggelsen av kirken. Han kunne ikke gjøre noe usynlig i et fullsatt rom.</w:t>
@@ -4008,7 +4008,7 @@
     </w:p>
     <w:p>
       <w:r>
-        <w:t xml:space="preserve">Jeg stod i det dalende snøværet blant naboene mine med Pip lent mot støvelen min, Emmas vottekledde hånd fant min på den ene siden og Fionas på den andre. Jeg så på alt sammen, lyktene, snøen, gullyset, de hundre ansiktene vendt opp mot himmelen, og jeg forstod, på den brystdype måten som kommer før hodet rekker å henge med, nøyaktig hva som stod på spill. Ikke en bygning. Ikke en gang en hemmelighet. Dette. Denne samlingen, denne byen som viste seg fra sin aller beste side på en kald og strålende dag. En mann hadde strukket seg ut fra mørket for å kreve løsepenger for en bit av dette, for å forvandle det til et våpen og en skrekk. Der jeg stod i snøen, ble sinnet mitt hardt og klart som kulden. Uansett hva det kostet meg, skulle jeg ikke la ham beholde grepet om det. Jeg skulle bringe det ut i lyset, inn i en dag som denne, der ting kunne leges.</w:t>
+        <w:t xml:space="preserve">Jeg stod i det dalende snøværet blant naboene mine med Pip lent mot støvelen min, mens Emmas vottekledde hånd fant min på den ene siden og Fionas på den andre. Jeg så på alt sammen, lyktene, snøen, gullyset, de hundre ansiktene vendt opp mot himmelen, og jeg forstod, på den brystdype måten som kommer før hodet rekker å henge med, nøyaktig hva som stod på spill. Ikke en bygning. Ikke en gang en hemmelighet. Dette. Denne samlingen, denne byen som viste seg fra sin aller beste side på en kald og strålende dag. En mann hadde strukket seg ut fra mørket for å kreve løsepenger for en bit av dette, for å forvandle det til et våpen og en skrekk. Der jeg stod i snøen, ble sinnet mitt hardt og klart som kulden. Uansett hva det kostet meg, skulle jeg ikke la ham beholde grepet om det. Jeg skulle bringe det ut i lyset, inn i en dag som denne, der ting kunne leges.</w:t>
       </w:r>
     </w:p>
     <w:p>
@@ -4050,7 +4050,7 @@
     <w:p/>
     <w:p>
       <w:r>
-        <w:t>Jeg bredte det hele ut på kjøkkenbordet den kvelden, hver eneste del av det: de to lappene, kopien jeg hadde laget av Theos katalogkort og den tjukke mappa Neil hadde gitt meg. Deretter tvang jeg meg til å sette meg ned og se på det uten å vike unna. Pip hadde gitt opp å få oppmerksomhet fra meg og lagt seg til å sove på ovnsforleggeren.</w:t>
+        <w:t>Jeg bredte det hele ut på kjøkkenbordet den kvelden, hver eneste del av det: de to lappene, kopien jeg hadde laget av Theos katalogkort og den tjukke mappa Neil hadde gitt meg. Deretter tvang jeg meg til å sette meg ned og se på det uten å vike unna. Pip hadde gitt opp å få oppmerksomhet fra meg og lagt seg til å sove på teppet foran ildstedet.</w:t>
       </w:r>
     </w:p>
     <w:p/>
@@ -4259,7 +4259,7 @@
     <w:p/>
     <w:p>
       <w:r>
-        <w:t xml:space="preserve">Vera kunne det. Vera hadde skjøtet, beviset på kjøpet, i skuffene bak stolen sin. Vera bar papirer fra ordførerens kontor over til arkivet, inn og ut, helt naturlig som været, med all den adgangen til Theo og brevpapiret hans som et menneske kunne ønske seg. Og Vera beveget seg gjennom byen uten at noen la merke til det, en kvinne som utførte byens ærend. Hun kunne legge fra seg en konvolutt på vertshusets resepsjonsskranke midt i festivalmylderet uten at noen ville ense det en tanke, ordførerens sekretær som svingte innom vertshuset. Jeg hadde gått forbi henne på vertshustrappen selv, den morgenen den andre lappen kom, og ikke ofret det en tanke.</w:t>
+        <w:t xml:space="preserve">Vera kunne det. Vera hadde skjøtet, beviset på kjøpet, i skuffene bak stolen sin. Vera bar papirer fra ordførerens kontor over til arkivet, inn og ut, helt naturlig som været, med all den adgangen til Theo og brevpapiret hans som et menneske kunne ønske seg. Og Vera beveget seg gjennom byen uten at noen la merke til det, en kvinne som utførte byens ærend. Hun kunne legge fra seg en konvolutt på vertshusets resepsjonsskranke midt i festivalmylderet uten at noen ville tenke noe over det, ordførerens sekretær som svingte innom vertshuset. Jeg hadde gått forbi henne på vertshustrappen selv, den morgenen den andre lappen kom, og ikke ofret det en tanke.</w:t>
       </w:r>
     </w:p>
     <w:p/>
@@ -4360,7 +4360,7 @@
     <w:p/>
     <w:p>
       <w:r>
-        <w:t>– Jeg kan ikke grave det ned, sa jeg. – Jeg har lyst til det. Gud vet at jeg har lyst til å gå bort dit i kveld, hviske alt sammen vekk og la alle beholde livene sine. Men hvis jeg gjør det, slutter Fiona aldri å være redd, ikke på ordentlig. Theo slipper aldri å bli en mann som kan bli tilgitt. Og råten blir liggende nede i veggen der jeg ikke kan se den, og vokser. Jeg presset håndflatene mot øynene. – Den snille måten og den enkle måten er ikke det samme. Det må fram i lyset. Alt sammen. Ordentlig. Med Noriko Tanaka. Med loven involvert, gjort på en skånsom måte, med barmhjertighet, men gjort. Det er den eneste måten Fiona noensinne blir fri fra det på, og den eneste måten Theo noen gang kan bli noe annet enn en mann med en forbrytelse begravet under gulvplankene.</w:t>
+        <w:t>– Jeg kan ikke grave det ned, sa jeg. – Jeg har lyst til det. Gud vet at jeg har lyst til å gå bort dit i kveld, hviske alt sammen vekk og la alle beholde livene sine. Men hvis jeg gjør det, slutter Fiona aldri å være redd, ikke på ordentlig. Theo trenger aldri å bli en mann som kan tilgis. Og råten blir liggende nede i veggen der jeg ikke kan se den, og vokser. Jeg presset håndflatene mot øynene. – Den snille måten og den enkle måten er ikke det samme. Det må fram i lyset. Alt sammen. Ordentlig. Med Noriko Tanaka. Med loven involvert, gjort på en skånsom måte, med barmhjertighet, men gjort. Det er den eneste måten Fiona noensinne blir fri fra det på, og den eneste måten Theo noen gang kan bli noe annet enn en mann med en forbrytelse begravet under gulvplankene.</w:t>
       </w:r>
     </w:p>
     <w:p/>
@@ -4467,7 +4467,7 @@
     <w:p/>
     <w:p>
       <w:r>
-        <w:t xml:space="preserve">Det var riktig. Det var så mye bedre enn fellen jeg hadde sett for meg, en natt med lokkepenger, holdt pusten og noens hånd som strakte seg ut fra mørket. Det ville ikke være snakk om noe mørke her overhodet. Vi skulle gjøre det i et varmt rom i ettermiddagslyset, med nåde i hendene og politisjefen ved vår side, og vi skulle gi en god mann som hadde gått vill, den enkle verdigheten det er å stå oppreist på egne ben og se det i øynene.</w:t>
+        <w:t xml:space="preserve">Det var riktig. Det var så mye bedre enn fellen jeg hadde sett for meg, en natt med lokkepenger, tilbakeholdt pust og noens hånd som strakte seg ut fra mørket. Det ville ikke være snakk om noe mørke her overhodet. Vi skulle gjøre det i et varmt rom i ettermiddagslyset, med nåde i hendene og politisjefen ved vår side, og vi skulle gi en god mann som hadde gått vill, den enkle verdigheten det er å stå oppreist på egne ben og se det i øynene.</w:t>
       </w:r>
     </w:p>
     <w:p/>
@@ -4485,7 +4485,7 @@
     <w:p/>
     <w:p>
       <w:r>
-        <w:t>– Du har vært redd for feil hemmelighet hele tiden, sa jeg til henne. – Du trodde hemmeligheten var at Constance var en tyv. Les dette, Fiona. Blackburn-familien hadde ikke betalt henne på flere måneder. Moren hennes lå døende tre gater unna uten penger til en lege. De sa til en ung jente at hun skulle være takknemlig for et tak over hodet mens en formue lå i en boks hun tørket støv av hver eneste dag. Hun stjal ikke fra mennesker som hadde behandlet henne rettferdig. Hun tok fra folk som hadde ranet henne først, og hun bygget hundre år med ærlig gjestfrihet på toppen av det. Jeg lukket hendene hennes rundt mappen. – Det er ikke en hemmelighet som ødelegger deg. Det er en historie du kan stå rakrygget i. Utpressingen fungerte bare fordi du har brukt hele livet ditt på å skjule den halvparten som skammet deg, og aldri visste at det fantes en halvdel som ikke gjør det.</w:t>
+        <w:t>– Du har vært redd for feil hemmelighet hele tiden, sa jeg til henne. – Du trodde hemmeligheten var at Constance var en tyv. Les dette, Fiona. Blackburn-familien hadde ikke betalt henne på flere måneder. Moren hennes lå døende tre gater unna uten penger til en lege. De sa til en ung jente at hun skulle være takknemlig for et tak over hodet mens en formue lå i en boks hun tørket støv av hver eneste dag. Hun stjal ikke fra mennesker som hadde behandlet henne rettferdig. Hun tok fra folk som hadde ranet henne først, og hun bygget hundre år med ærlig gjestfrihet på toppen av det. Jeg lukket hendene hennes rundt mappen. – Det er ikke en hemmelighet som ødelegger deg. Det er en historie du kan stå rakrygget i. Utpressingen fungerte bare fordi du har brukt hele livet ditt på å skjule den halvparten du skammet deg over, og aldri visste at det fantes en halvdel som ikke gjør det.</w:t>
       </w:r>
     </w:p>
     <w:p/>
@@ -4610,7 +4610,7 @@
     <w:p/>
     <w:p>
       <w:r>
-        <w:t>– Vera, sa jeg. – Theo visste om tyveriet. Men lappene visste at vertshuset var kjøpt for brosjepengene, og det sto aldri i noe Blackburn-brev. Det er en eiendomsnotering. Et skjøte. Og skjøtet til dette vertshuset lå ute av skuffen sin i arkiveringskurven din i går morges, rørt ved, på skrivebordet til en kvinne som hadde sagt til meg to ganger at hun aldri leser arkivene som står bak henne. Jeg holdt stemmen myk. – Han visste om tyveriet. Du hadde skjøtet. Og du hadde beina, Vera. Han kunne ikke ha krysset denne byen ubemerket for sitt bare liv, alle kjenner Theo, alle stanser ham. Men ingen blunker over at ordførerens sekretær stikker innom vertshuset under festivalen. Jeg gikk forbi deg på trappen der den morges, med parkeringsbevisene dine. Han kunne ikke ha gjort det alene. Han trengte noen som kunne bevege seg gjennom byen usett. Det var deg.</w:t>
+        <w:t>– Vera, sa jeg. – Theo visste om tyveriet. Men lappene visste at vertshuset var kjøpt for brosjepengene, og det sto aldri i noe Blackburn-brev. Det er et eiendomsdokument. Et skjøte. Og skjøtet til dette vertshuset lå ute av skuffen sin i kurven din for gjeninnplassering i går morges, rørt ved, på skrivebordet til en kvinne som hadde sagt til meg to ganger at hun aldri leser arkivene som står bak henne. Jeg holdt stemmen myk. – Han visste om tyveriet. Du hadde skjøtet. Og du hadde beina, Vera. Han kunne ikke ha krysset denne byen ubemerket for sitt bare liv, alle kjenner Theo, alle stanser ham. Men ingen blunker over at ordførerens sekretær stikker innom vertshuset under festivalen. Jeg gikk forbi deg på trappen den morgenen, med parkeringsbevisene dine. Han kunne ikke ha gjort det alene. Han trengte noen som kunne bevege seg gjennom byen usett. Det var deg.</w:t>
       </w:r>
     </w:p>
     <w:p/>
@@ -4628,7 +4628,7 @@
     <w:p/>
     <w:p>
       <w:r>
-        <w:t>Rommet ble stille etter det, bortsett fra gråten og de fjerne lydene av festivalen som ble pakket sammen utenfor. To mennesker som hadde gjort en grusom handling av årsaker de hadde kledd ut i fine ord helt til de ikke lenger kunne se hva som lå under, satt nå i vrakgodset av det, og tok det endelig på sin kappe, høyt og tydelig. Ingen felle hadde klappet igjen. Ingen hadde strukket seg ut fra mørket. Vi hadde lagt det ut helt og rent i et varmt rom i ettermiddagslyset og gitt dem sjansen til å være ærlige. De hadde grepet den, for til syvende og sist, akkurat slik Noriko hadde sagt, er de fleste mennesker så trette til døds av å bære på det.</w:t>
+        <w:t>Rommet ble stille etter det, bortsett fra gråten og de fjerne lydene av festivalen som ble pakket sammen utenfor. To mennesker som hadde gjort en grusom handling av årsaker de hadde kledd ut i fine ord helt til de ikke lenger kunne se hva som lå under, satt nå i vrakgodset av det, og tok det endelig på sin kappe, høyt og tydelig. Ingen felle hadde klappet igjen. Ingen hadde strukket seg ut fra mørket. Vi hadde lagt det ut helt og rent i et varmt rom i ettermiddagslyset og gitt dem sjansen til å være ærlige. De hadde grepet den, for til syvende og sist, akkurat slik Noriko hadde sagt, er de fleste mennesker halvt dødstrette av å bære på det.</w:t>
       </w:r>
     </w:p>
     <w:p/>
@@ -4663,7 +4663,7 @@
     <w:p/>
     <w:p>
       <w:r>
-        <w:t xml:space="preserve">Begge to hadde lagt alt på bordet momentant da de ble konfrontert, ingen av dem hadde noen historikk med svik bak seg, og kvinnen de hadde forgrepet seg på, ba om oppreisning framfor ødeleggelse. Dermed staket Noriko ut en kurs for dem som verken var en fengselscelle eller en full benådning.</w:t>
+        <w:t xml:space="preserve">Begge to hadde lagt alt på bordet momentant da de ble konfrontert, ingen av dem hadde noen historikk med å skade noen, og kvinnen de hadde gjort urett mot, ba om oppreisning framfor ødeleggelse. Dermed staket Noriko ut en kurs for dem som verken var en fengselscelle eller en full benådning.</w:t>
       </w:r>
     </w:p>
     <w:p/>
@@ -4711,19 +4711,19 @@
     <w:p/>
     <w:p>
       <w:r>
-        <w:t>– Det er nøyaktig det du fortjener, sa Fiona til ham, og det lå stål i bunnen av all vennligheten. – Nemlig sjansen til å bli en mann som aldri ville ha funnet på å gjøre noe slikt i utgangspunktet. Du slipper den enkle utveien, Theo, der alle klemmer deg og alt er glemt til jul. Du får den virkelige. Du må fortjene det tilbake, år etter år, og kjenne på hvert år av det. Jeg er ikke slem med deg. Jeg tror du kan klare det. Jeg ville ikke giddet å måke fram en vei for deg om jeg trodde du ikke var mann til å gå den.</w:t>
-      </w:r>
-    </w:p>
-    <w:p/>
-    <w:p>
-      <w:r>
-        <w:t>Det Fiona ga Theo, var hardere enn en tilgivelse og så mye bedre. Hun rakte ham den lange veien tilbake, og sin tro på at han kunne gå den. Det tvang ham til å bære hele vekten av det han hadde gjort, og deretter puttet hun en spade i hendene hans i stedet for en dom.</w:t>
-      </w:r>
-    </w:p>
-    <w:p/>
-    <w:p>
-      <w:r>
-        <w:t>Vera dro jeg for å oppsøke på tomannshånd etterpå. Jeg fant henne i ferd med å pakke ned de siste sakene fra skrivebordet på rådhuset, og jeg hjalp henne med å bære en eske ut til bilen hennes. Pip ventet på den nederste trappen med blikket festet på en papirtyngde i messing som stakk opp av toppen. Der på den kalde trappen fortalte jeg Vera det jeg hadde kommet for å si.</w:t>
+        <w:t>– Det er nøyaktig det du fortjener, sa Fiona til ham, og det lå stål i bunnen av all vennligheten. – Nemlig sjansen til å bli en mann som aldri ville ha funnet på å gjøre noe slikt i utgangspunktet. Du får ikke den enkle versjonen, Theo, der alle klemmer deg og alt er glemt til jul. Du får den virkelige. Du må fortjene det tilbake, år etter år, og kjenne på hvert år av det. Jeg er ikke slem med deg. Jeg tror du kan klare det. Jeg ville ikke giddet å måke fram en vei for deg om jeg trodde du ikke var mann til å gå den.</w:t>
+      </w:r>
+    </w:p>
+    <w:p/>
+    <w:p>
+      <w:r>
+        <w:t>Det Fiona ga Theo, var hardere enn en benådning og så mye bedre. Hun rakte ham den lange veien tilbake, og sin tro på at han kunne gå den. Det tvang ham til å bære hele vekten av det han hadde gjort, og deretter puttet hun en spade i hendene hans i stedet for en dom.</w:t>
+      </w:r>
+    </w:p>
+    <w:p/>
+    <w:p>
+      <w:r>
+        <w:t>Vera dro jeg for å oppsøke på tomannshånd etterpå. Jeg fant henne i ferd med å pakke ned de siste sakene fra skrivebordet på rådhuset, og jeg hjalp henne med å bære en eske ut til bilen hennes. Pip ventet på det nederste trinnet med blikket festet på en papirtyngde i messing som stakk opp av toppen. Der på den kalde trappen fortalte jeg Vera det jeg hadde kommet for å si.</w:t>
       </w:r>
     </w:p>
     <w:p/>
@@ -4770,7 +4770,7 @@
     <w:p/>
     <w:p>
       <w:r>
-        <w:t xml:space="preserve">De hadde hørt det, selvfølgelig. Ingenting slikt holdt seg skjult i Frost Falls lenger enn en formiddag. Det velpolerte, velmenende Worthington-paret hadde skjønt det, ut fra festivalens summing og vertshusets stillhet, at Historielaget var i alvorlige problemer, og at disse problemene hadde drevet en god mann ut på et skråplan. Herr Worthington fant meg på vertshusets veranda den siste morgenen de var der, med sin kone ved sin side i sin kremfargede kashmirgenser og med sin fine kåpe over armen, og han kom rett til sak med den selvfølgeligheten som kjennetegner en mann for hvem penger aldri har vært et vanskelig samtaleemne.</w:t>
+        <w:t xml:space="preserve">De hadde hørt det, selvfølgelig. Ingenting slikt holdt seg skjult i Frost Falls lenger enn en formiddag. Det velpolerte, velmenende Worthington-paret hadde skjønt det, ut fra festivalens summing og vertshusets stillhet, at Historielaget var i alvorlige problemer, og at disse problemene hadde drevet en god mann ut på et skråplan. Herr Worthington fant meg på vertshusets veranda den siste morgenen de var der, mens kona hans sto ved siden av ham i den kremfargede kashmirgenseren sin med den fine kåpen sin over armen, og han kom rett til sak med den selvfølgeligheten som kjennetegner en mann for hvem penger aldri har vært et vanskelig samtaleemne.</w:t>
       </w:r>
     </w:p>
     <w:p/>
@@ -4919,7 +4919,7 @@
     <w:p/>
     <w:p>
       <w:r>
-        <w:t>Hun kom opp til hytta noen dager etterpå, med Neils mappe under armen og et blikk i ansiktet jeg ikke hadde sett der før, samlet og litt uforsonlig.</w:t>
+        <w:t>Hun kom opp til hytta noen dager etterpå, med Neils mappe under armen og et blikk i ansiktet jeg ikke hadde sett der før, samlet og litt kampklar.</w:t>
       </w:r>
     </w:p>
     <w:p/>
@@ -4985,7 +4985,7 @@
     <w:p/>
     <w:p>
       <w:r>
-        <w:t xml:space="preserve">Og Martha. Martha tok tak i hånden min i syklubben en grå ettermiddag, holdt den og sa: – Husker du, for en stund siden, da jeg sa at du ikke trengte å bære ting alene? At en syklubb er til for å lene seg på? Jeg sa at jeg husket det godt. – Vel, sa hun, – du dro jammen og beviste at du er en av oss, som bar det på den måten du gjorde. Du lente deg ikke bare på syklubben da du trengte det. Du var syklubben, for Fiona, da hun ikke hadde noen andre. En fremmed gjør ikke slikt, Jessica. En av våre egne gjør det. Og hun klappet hånden min raskt og gikk rett tilbake til votten sin, som om hun ikke akkurat hadde knust meg fullstendig der jeg satt.</w:t>
+        <w:t xml:space="preserve">Og Martha. Martha tok tak i hånden min i syklubben en grå ettermiddag, holdt den og sa: – Husker du, for en stund siden, da jeg sa at du ikke trengte å bære ting alene? At en syklubb er til for å lene seg på? Jeg sa at jeg husket det godt. – Vel, sa hun, – du dro jammen og beviste at du er en av oss, som bar det på den måten du gjorde. Du lente deg ikke bare på syklubben da du trengte det. Du var syklubben, for Fiona, da hun ikke hadde noen andre. En fremmed gjør ikke slikt, Jessica. En av våre egne gjør det. Og hun klappet hånden min raskt og gikk rett tilbake til votten sin, som om hun ikke nettopp hadde rørt meg helt i stykker der jeg satt.</w:t>
       </w:r>
     </w:p>
     <w:p/>
@@ -5014,7 +5014,7 @@
     <w:p/>
     <w:p>
       <w:r>
-        <w:t xml:space="preserve">Theo hadde levert tilbake Blackburn-brevene, hvert eneste et, som en del av oppgjøret sitt, og jeg holdt på å sortere dem på nytt sammen med Olivia og Dot en kald ettermiddag. Vi satt tre stykker rundt det lange arbeidsbordet med den gode lampen trukket tett inntil, da jeg kom over et brev jeg ikke hadde sett før. Det handlet ikke om brosjen. Det beskrev en vinterdag i 1924 da byens familier hadde samlet seg på allmenningen, lagt en boks med byens skatter oppi og gravd den ned under den store almen, </w:t>
+        <w:t xml:space="preserve">Theo hadde levert tilbake Blackburn-brevene, hvert eneste et, som en del av oppgjøret sitt, og jeg holdt på å sortere dem på nytt sammen med Olivia og Dot en kald ettermiddag. Vi satt tre stykker rundt det lange arbeidsbordet med den gode lampen trukket tett inntil, da jeg kom over et brev jeg ikke hadde sett før. Det handlet ikke om brosjen. Det beskrev en vinterdag i 1924 da byens familier hadde samlet seg på allmenningen, forseglet en boks med byens skatter og gravd den ned under den store almen, </w:t>
       </w:r>
       <w:r>
         <w:rPr>
@@ -5056,7 +5056,7 @@
     <w:p/>
     <w:p>
       <w:r>
-        <w:t>Den kom opp fra den kalde jorden, innpakket i tjære og tid, en kobberboks som hadde blitt irrgrønn med årene, tung og tett forseglet, akkurat slik en hånd hadde satt den fra seg hundre juler før de fleste av oss ble født.</w:t>
+        <w:t>Den kom opp fra den kalde jorden, innpakket i tjære og tid, en kobberboks som hadde blitt irrgrønn med årene, tung og tett forseglet, akkurat der en hånd hadde satt den fra seg hundre juler før de fleste av oss ble født.</w:t>
       </w:r>
     </w:p>
     <w:p/>
@@ -5217,13 +5217,13 @@
     <w:p/>
     <w:p>
       <w:r>
-        <w:t xml:space="preserve">Kristtornen sto oppi der, kvisten fra gresskaret, stående i et par centimeter vann. De tre bladene var mørke og blanke, og bærene var like røde som den ettermiddagen den kom opp av jorden.</w:t>
-      </w:r>
-    </w:p>
-    <w:p/>
-    <w:p>
-      <w:r>
-        <w:t xml:space="preserve">– Det har ikke en gang hengt med hodet, hvisket hun, med et blikk bort på faren, som hadde stanset for å snakke med en nabo over gjerdet. – Jeg skifter vannet hver eneste morgen. Pappa tror jeg tok den fra kransen på vertshuset.</w:t>
+        <w:t xml:space="preserve">Kristtornen sto oppi der, kvisten fra gresskaret, stående i et par centimeter vann. De tre bladene var mørke og blanke, og bærene var like røde som den ettermiddagen den spirte fram.</w:t>
+      </w:r>
+    </w:p>
+    <w:p/>
+    <w:p>
+      <w:r>
+        <w:t xml:space="preserve">– Den har ikke engang hengt med hodet, hvisket hun, med et blikk bort på faren, som hadde stanset for å snakke med en nabo over gjerdet. – Jeg skifter vannet hver eneste morgen. Pappa tror jeg tok den fra kransen på vertshuset.</w:t>
       </w:r>
     </w:p>
     <w:p/>
@@ -5781,13 +5781,13 @@
     <w:p/>
     <w:p>
       <w:r>
-        <w:t xml:space="preserve">Allmenningen lå tvers overfor Yarn Tales, et bredt, hvitt fellesareal med musikkpaviljongen i den ene enden og krigsminnesmerket i den andre. Skolebarna hadde bygd en rekke med snømenn der i løpet av det første ordentlige snøfallet. Tre stykker, tjukke og skjeve og kronet med det ungene kunne oppdrive. I går, slik Ellie sa det, hadde de snudd seg mot veien, med kulløyne og et lunt uttrykk, og fulgt med på trafikken som snømenn gjerne gjør. Jeg hadde gått forbi dem selv kvelden før. De hadde vendt ansiktene mot gaten.</w:t>
-      </w:r>
-    </w:p>
-    <w:p/>
-    <w:p>
-      <w:r>
-        <w:t>I morges hadde den i midten snudd seg helt rundt.</w:t>
+        <w:t xml:space="preserve">Allmenningen lå tvers overfor Yarn Tales, et bredt, hvitt fellesareal med musikkpaviljongen i den ene enden og krigsminnesmerket i den andre. Skolebarna hadde bygd en rekke med snømenn der i løpet av det første ordentlige snøfallet. Tre stykker, tjukke og skjeve og kronet med det ungene kunne oppdrive. I går, slik Ellie sa det, hadde de stått vendt mot veien, med kulløyne og et lunt uttrykk, og fulgt med på trafikken som snømenn gjerne gjør. Jeg hadde gått forbi dem selv kvelden før. De hadde vendt ansiktene mot gaten.</w:t>
+      </w:r>
+    </w:p>
+    <w:p/>
+    <w:p>
+      <w:r>
+        <w:t>Denne morgenen hadde den i midten snudd seg helt rundt.</w:t>
       </w:r>
     </w:p>
     <w:p/>
@@ -5840,7 +5840,7 @@
     <w:p/>
     <w:p>
       <w:r>
-        <w:t xml:space="preserve">For jeg kjenner forskjellen. Jeg har levd lenge nå side om side med julemagien. Lenge nok til å kjenne den i marg og bein, like tydelig som et fotavtrykk i min egen trapp. Dette var ikke et barn med kalde fingre. Magien var løs i Frost Falls. Den hadde vært løs siden vi kom, på jakt etter et hjem. Mannen min holdt på å bygge et til den. Langsomt og tålmodig i verkstedet sitt, et ildsted for den å finne hvile i, og den kom nærmere ilden for hver dag som gikk. Men den hadde ikke funnet roen ennå. Den var fremdeles ute i byen om natten, varm og klumsete og helt uten ondskap, og gjorde de små, umulige tingene som magi gjør når den har mer følelser enn fornuft. Gjorde festivallysene om fra oransje til gylne. Og nå, å dømme etter dette, gikk den rundt og snudde barns snømenn i mørket slik at de så mot det som hadde fanget dens omflakkende oppmerksomhet.</w:t>
+        <w:t xml:space="preserve">For jeg kjenner forskjellen. Jeg har levd lenge nå side om side med julemagien. Lenge nok til å kjenne den i marg og bein, like tydelig som skritt i min egen trapp. Dette var ikke et barn med kalde fingre. Magien var løs i Frost Falls. Den hadde vært løs siden vi kom, på jakt etter et hjem. Mannen min holdt på å bygge et til den. Langsomt og tålmodig i verkstedet sitt, et ildsted for den å finne hvile i, og den kom nærmere ilden for hver dag som gikk. Men den hadde ikke funnet roen ennå. Den var fremdeles ute i byen om natten, varm og klumsete og helt uten ondskap, og gjorde de små, umulige tingene som magi gjør når den har mer følelser enn fornuft. Gjorde festivallysene om fra oransje til gylne. Og nå, å dømme etter dette, gikk den rundt og snudde barns snømenn i mørket slik at de så mot det som hadde fanget dens omflakkende oppmerksomhet.</w:t>
       </w:r>
     </w:p>
     <w:p/>

</xml_diff>